<commit_message>
feat(web): Main features for web template
</commit_message>
<xml_diff>
--- a/docs/SRS.docx
+++ b/docs/SRS.docx
@@ -3,6 +3,9 @@
 <w:document xmlns:wpc="http://schemas.microsoft.com/office/word/2010/wordprocessingCanvas" xmlns:cx="http://schemas.microsoft.com/office/drawing/2014/chartex" xmlns:cx1="http://schemas.microsoft.com/office/drawing/2015/9/8/chartex" xmlns:cx2="http://schemas.microsoft.com/office/drawing/2015/10/21/chartex" xmlns:cx3="http://schemas.microsoft.com/office/drawing/2016/5/9/chartex" xmlns:cx4="http://schemas.microsoft.com/office/drawing/2016/5/10/chartex" xmlns:cx5="http://schemas.microsoft.com/office/drawing/2016/5/11/chartex" xmlns:cx6="http://schemas.microsoft.com/office/drawing/2016/5/12/chartex" xmlns:cx7="http://schemas.microsoft.com/office/drawing/2016/5/13/chartex" xmlns:cx8="http://schemas.microsoft.com/office/drawing/2016/5/14/chartex" xmlns:mc="http://schemas.openxmlformats.org/markup-compatibility/2006" xmlns:aink="http://schemas.microsoft.com/office/drawing/2016/ink" xmlns:am3d="http://schemas.microsoft.com/office/drawing/2017/model3d" xmlns:o="urn:schemas-microsoft-com:office:office" xmlns:oel="http://schemas.microsoft.com/office/2019/extlst" xmlns:r="http://schemas.openxmlformats.org/officeDocument/2006/relationships" xmlns:m="http://schemas.openxmlformats.org/officeDocument/2006/math" xmlns:v="urn:schemas-microsoft-com:vml" xmlns:wp14="http://schemas.microsoft.com/office/word/2010/wordprocessingDrawing" xmlns:wp="http://schemas.openxmlformats.org/drawingml/2006/wordprocessingDrawing" xmlns:w10="urn:schemas-microsoft-com:office:word" xmlns:w="http://schemas.openxmlformats.org/wordprocessingml/2006/main" xmlns:w14="http://schemas.microsoft.com/office/word/2010/wordml" xmlns:w15="http://schemas.microsoft.com/office/word/2012/wordml" xmlns:w16cex="http://schemas.microsoft.com/office/word/2018/wordml/cex" xmlns:w16cid="http://schemas.microsoft.com/office/word/2016/wordml/cid" xmlns:w16="http://schemas.microsoft.com/office/word/2018/wordml" xmlns:w16du="http://schemas.microsoft.com/office/word/2023/wordml/word16du" xmlns:w16sdtdh="http://schemas.microsoft.com/office/word/2020/wordml/sdtdatahash" xmlns:w16sdtfl="http://schemas.microsoft.com/office/word/2024/wordml/sdtformatlock" xmlns:w16se="http://schemas.microsoft.com/office/word/2015/wordml/symex" xmlns:wpg="http://schemas.microsoft.com/office/word/2010/wordprocessingGroup" xmlns:wpi="http://schemas.microsoft.com/office/word/2010/wordprocessingInk" xmlns:wne="http://schemas.microsoft.com/office/word/2006/wordml" xmlns:wps="http://schemas.microsoft.com/office/word/2010/wordprocessingShape" mc:Ignorable="w14 w15 w16se w16cid w16 w16cex w16sdtdh w16sdtfl w16du wp14">
   <w:body>
     <w:p>
+      <w:pPr>
+        <w:jc w:val="center"/>
+      </w:pPr>
       <w:r>
         <w:rPr>
           <w:noProof/>
@@ -97,6 +100,7 @@
     </w:p>
     <w:p>
       <w:pPr>
+        <w:jc w:val="center"/>
         <w:rPr>
           <w:rFonts w:asciiTheme="majorHAnsi" w:eastAsiaTheme="majorEastAsia" w:hAnsiTheme="majorHAnsi" w:cstheme="majorBidi"/>
           <w:b/>
@@ -110,6 +114,7 @@
     </w:p>
     <w:p>
       <w:pPr>
+        <w:jc w:val="center"/>
         <w:rPr>
           <w:rFonts w:ascii="Aptos Narrow" w:eastAsia="Aptos Narrow" w:hAnsi="Aptos Narrow" w:cs="Aptos Narrow"/>
         </w:rPr>
@@ -142,6 +147,7 @@
     </w:p>
     <w:p>
       <w:pPr>
+        <w:jc w:val="center"/>
         <w:rPr>
           <w:rFonts w:ascii="Aptos Narrow" w:eastAsia="Aptos Narrow" w:hAnsi="Aptos Narrow" w:cs="Aptos Narrow"/>
         </w:rPr>
@@ -154,6 +160,7 @@
     </w:p>
     <w:p>
       <w:pPr>
+        <w:jc w:val="center"/>
         <w:rPr>
           <w:rFonts w:ascii="Montserrat" w:eastAsia="Montserrat" w:hAnsi="Montserrat" w:cs="Montserrat"/>
           <w:sz w:val="28"/>
@@ -163,6 +170,7 @@
     </w:p>
     <w:p>
       <w:pPr>
+        <w:jc w:val="center"/>
         <w:rPr>
           <w:rFonts w:ascii="Montserrat" w:eastAsia="Montserrat" w:hAnsi="Montserrat" w:cs="Montserrat"/>
           <w:sz w:val="28"/>
@@ -175,11 +183,12 @@
           <w:sz w:val="28"/>
           <w:szCs w:val="28"/>
         </w:rPr>
-        <w:t xml:space="preserve">Project Title: </w:t>
+        <w:t>Project Title:</w:t>
       </w:r>
     </w:p>
     <w:p>
       <w:pPr>
+        <w:jc w:val="center"/>
         <w:rPr>
           <w:rFonts w:ascii="Montserrat" w:eastAsia="Montserrat" w:hAnsi="Montserrat" w:cs="Montserrat"/>
           <w:sz w:val="28"/>
@@ -205,6 +214,7 @@
     </w:p>
     <w:p>
       <w:pPr>
+        <w:jc w:val="center"/>
         <w:rPr>
           <w:rFonts w:ascii="Montserrat" w:eastAsia="Montserrat" w:hAnsi="Montserrat" w:cs="Montserrat"/>
           <w:sz w:val="28"/>
@@ -225,53 +235,39 @@
           <w:sz w:val="28"/>
           <w:szCs w:val="28"/>
         </w:rPr>
-        <w:t xml:space="preserve">February </w:t>
+        <w:t>May 5, 2026</w:t>
       </w:r>
-      <w:r>
+    </w:p>
+    <w:p>
+      <w:pPr>
+        <w:jc w:val="center"/>
         <w:rPr>
           <w:rFonts w:ascii="Montserrat" w:eastAsia="Montserrat" w:hAnsi="Montserrat" w:cs="Montserrat"/>
           <w:sz w:val="28"/>
           <w:szCs w:val="28"/>
         </w:rPr>
-        <w:t>6</w:t>
-      </w:r>
+      </w:pPr>
       <w:r>
         <w:rPr>
           <w:rFonts w:ascii="Montserrat" w:eastAsia="Montserrat" w:hAnsi="Montserrat" w:cs="Montserrat"/>
           <w:sz w:val="28"/>
           <w:szCs w:val="28"/>
         </w:rPr>
-        <w:t>, 2026</w:t>
+        <w:t xml:space="preserve">Version: </w:t>
+      </w:r>
+      <w:r>
+        <w:rPr>
+          <w:rFonts w:ascii="Montserrat" w:eastAsia="Montserrat" w:hAnsi="Montserrat" w:cs="Montserrat"/>
+          <w:sz w:val="28"/>
+          <w:szCs w:val="28"/>
+        </w:rPr>
+        <w:t>1</w:t>
       </w:r>
     </w:p>
     <w:p>
       <w:pPr>
-        <w:rPr>
-          <w:rFonts w:ascii="Montserrat" w:eastAsia="Montserrat" w:hAnsi="Montserrat" w:cs="Montserrat"/>
-          <w:sz w:val="28"/>
-          <w:szCs w:val="28"/>
-        </w:rPr>
-      </w:pPr>
-      <w:r>
-        <w:rPr>
-          <w:rFonts w:ascii="Montserrat" w:eastAsia="Montserrat" w:hAnsi="Montserrat" w:cs="Montserrat"/>
-          <w:sz w:val="28"/>
-          <w:szCs w:val="28"/>
-        </w:rPr>
-        <w:t xml:space="preserve">Version: </w:t>
-      </w:r>
-      <w:r>
-        <w:rPr>
-          <w:rFonts w:ascii="Montserrat" w:eastAsia="Montserrat" w:hAnsi="Montserrat" w:cs="Montserrat"/>
-          <w:sz w:val="28"/>
-          <w:szCs w:val="28"/>
-        </w:rPr>
-        <w:t>2</w:t>
-      </w:r>
-    </w:p>
-    <w:p>
-      <w:pPr>
         <w:pStyle w:val="Heading1"/>
+        <w:jc w:val="both"/>
       </w:pPr>
     </w:p>
     <w:sdt>
@@ -299,6 +295,7 @@
         <w:p>
           <w:pPr>
             <w:pStyle w:val="TOCHeading"/>
+            <w:jc w:val="both"/>
           </w:pPr>
           <w:r>
             <w:rPr>
@@ -315,6 +312,7 @@
               <w:tab w:val="left" w:pos="720"/>
               <w:tab w:val="right" w:leader="dot" w:pos="8630"/>
             </w:tabs>
+            <w:jc w:val="both"/>
             <w:rPr>
               <w:noProof/>
               <w:kern w:val="2"/>
@@ -416,6 +414,7 @@
               <w:tab w:val="left" w:pos="1200"/>
               <w:tab w:val="right" w:leader="dot" w:pos="8630"/>
             </w:tabs>
+            <w:jc w:val="both"/>
             <w:rPr>
               <w:noProof/>
               <w:kern w:val="2"/>
@@ -508,6 +507,7 @@
               <w:tab w:val="left" w:pos="1200"/>
               <w:tab w:val="right" w:leader="dot" w:pos="8630"/>
             </w:tabs>
+            <w:jc w:val="both"/>
             <w:rPr>
               <w:noProof/>
               <w:kern w:val="2"/>
@@ -600,6 +600,7 @@
               <w:tab w:val="left" w:pos="1200"/>
               <w:tab w:val="right" w:leader="dot" w:pos="8630"/>
             </w:tabs>
+            <w:jc w:val="both"/>
             <w:rPr>
               <w:noProof/>
               <w:kern w:val="2"/>
@@ -692,6 +693,7 @@
               <w:tab w:val="left" w:pos="720"/>
               <w:tab w:val="right" w:leader="dot" w:pos="8630"/>
             </w:tabs>
+            <w:jc w:val="both"/>
             <w:rPr>
               <w:noProof/>
               <w:kern w:val="2"/>
@@ -784,6 +786,7 @@
               <w:tab w:val="left" w:pos="1200"/>
               <w:tab w:val="right" w:leader="dot" w:pos="8630"/>
             </w:tabs>
+            <w:jc w:val="both"/>
             <w:rPr>
               <w:noProof/>
               <w:kern w:val="2"/>
@@ -876,6 +879,7 @@
               <w:tab w:val="left" w:pos="1200"/>
               <w:tab w:val="right" w:leader="dot" w:pos="8630"/>
             </w:tabs>
+            <w:jc w:val="both"/>
             <w:rPr>
               <w:noProof/>
               <w:kern w:val="2"/>
@@ -968,6 +972,7 @@
               <w:tab w:val="left" w:pos="1200"/>
               <w:tab w:val="right" w:leader="dot" w:pos="8630"/>
             </w:tabs>
+            <w:jc w:val="both"/>
             <w:rPr>
               <w:noProof/>
               <w:kern w:val="2"/>
@@ -1060,6 +1065,7 @@
               <w:tab w:val="left" w:pos="1200"/>
               <w:tab w:val="right" w:leader="dot" w:pos="8630"/>
             </w:tabs>
+            <w:jc w:val="both"/>
             <w:rPr>
               <w:noProof/>
               <w:kern w:val="2"/>
@@ -1152,6 +1158,7 @@
               <w:tab w:val="left" w:pos="720"/>
               <w:tab w:val="right" w:leader="dot" w:pos="8630"/>
             </w:tabs>
+            <w:jc w:val="both"/>
             <w:rPr>
               <w:noProof/>
               <w:kern w:val="2"/>
@@ -1244,6 +1251,7 @@
               <w:tab w:val="left" w:pos="1200"/>
               <w:tab w:val="right" w:leader="dot" w:pos="8630"/>
             </w:tabs>
+            <w:jc w:val="both"/>
             <w:rPr>
               <w:noProof/>
               <w:kern w:val="2"/>
@@ -1336,6 +1344,7 @@
               <w:tab w:val="left" w:pos="1200"/>
               <w:tab w:val="right" w:leader="dot" w:pos="8630"/>
             </w:tabs>
+            <w:jc w:val="both"/>
             <w:rPr>
               <w:noProof/>
               <w:kern w:val="2"/>
@@ -1428,6 +1437,7 @@
               <w:tab w:val="left" w:pos="720"/>
               <w:tab w:val="right" w:leader="dot" w:pos="8630"/>
             </w:tabs>
+            <w:jc w:val="both"/>
             <w:rPr>
               <w:noProof/>
               <w:kern w:val="2"/>
@@ -1520,6 +1530,7 @@
               <w:tab w:val="left" w:pos="720"/>
               <w:tab w:val="right" w:leader="dot" w:pos="8630"/>
             </w:tabs>
+            <w:jc w:val="both"/>
             <w:rPr>
               <w:noProof/>
               <w:kern w:val="2"/>
@@ -1612,6 +1623,7 @@
               <w:tab w:val="left" w:pos="1200"/>
               <w:tab w:val="right" w:leader="dot" w:pos="8630"/>
             </w:tabs>
+            <w:jc w:val="both"/>
             <w:rPr>
               <w:noProof/>
               <w:kern w:val="2"/>
@@ -1704,6 +1716,7 @@
               <w:tab w:val="left" w:pos="1200"/>
               <w:tab w:val="right" w:leader="dot" w:pos="8630"/>
             </w:tabs>
+            <w:jc w:val="both"/>
             <w:rPr>
               <w:noProof/>
               <w:kern w:val="2"/>
@@ -1796,6 +1809,7 @@
               <w:tab w:val="left" w:pos="1200"/>
               <w:tab w:val="right" w:leader="dot" w:pos="8630"/>
             </w:tabs>
+            <w:jc w:val="both"/>
             <w:rPr>
               <w:noProof/>
               <w:kern w:val="2"/>
@@ -1888,6 +1902,7 @@
               <w:tab w:val="left" w:pos="1200"/>
               <w:tab w:val="right" w:leader="dot" w:pos="8630"/>
             </w:tabs>
+            <w:jc w:val="both"/>
             <w:rPr>
               <w:noProof/>
               <w:kern w:val="2"/>
@@ -1980,6 +1995,7 @@
               <w:tab w:val="left" w:pos="1200"/>
               <w:tab w:val="right" w:leader="dot" w:pos="8630"/>
             </w:tabs>
+            <w:jc w:val="both"/>
             <w:rPr>
               <w:noProof/>
               <w:kern w:val="2"/>
@@ -2072,6 +2088,7 @@
               <w:tab w:val="left" w:pos="720"/>
               <w:tab w:val="right" w:leader="dot" w:pos="8630"/>
             </w:tabs>
+            <w:jc w:val="both"/>
             <w:rPr>
               <w:noProof/>
               <w:kern w:val="2"/>
@@ -2158,6 +2175,9 @@
           </w:hyperlink>
         </w:p>
         <w:p>
+          <w:pPr>
+            <w:jc w:val="both"/>
+          </w:pPr>
           <w:r>
             <w:rPr>
               <w:b/>
@@ -2171,6 +2191,7 @@
     </w:sdt>
     <w:p>
       <w:pPr>
+        <w:jc w:val="both"/>
         <w:rPr>
           <w:rFonts w:asciiTheme="majorHAnsi" w:eastAsiaTheme="majorEastAsia" w:hAnsiTheme="majorHAnsi" w:cstheme="majorBidi"/>
           <w:b/>
@@ -2191,9 +2212,20 @@
           <w:ilvl w:val="0"/>
           <w:numId w:val="10"/>
         </w:numPr>
+        <w:jc w:val="both"/>
+        <w:rPr>
+          <w:rFonts w:cstheme="majorHAnsi"/>
+          <w:sz w:val="22"/>
+          <w:szCs w:val="22"/>
+        </w:rPr>
       </w:pPr>
       <w:bookmarkStart w:id="0" w:name="_Toc220513504"/>
       <w:r>
+        <w:rPr>
+          <w:rFonts w:cstheme="majorHAnsi"/>
+          <w:sz w:val="22"/>
+          <w:szCs w:val="22"/>
+        </w:rPr>
         <w:lastRenderedPageBreak/>
         <w:t>Introduction</w:t>
       </w:r>
@@ -2207,12 +2239,39 @@
           <w:numId w:val="10"/>
         </w:numPr>
         <w:ind w:right="432"/>
+        <w:jc w:val="both"/>
+        <w:rPr>
+          <w:rFonts w:cstheme="majorHAnsi"/>
+        </w:rPr>
       </w:pPr>
       <w:bookmarkStart w:id="1" w:name="_Toc220513505"/>
       <w:r>
+        <w:rPr>
+          <w:rFonts w:cstheme="majorHAnsi"/>
+        </w:rPr>
         <w:t>Purpose</w:t>
       </w:r>
       <w:bookmarkEnd w:id="1"/>
+    </w:p>
+    <w:p>
+      <w:pPr>
+        <w:pStyle w:val="NormalWeb"/>
+        <w:ind w:left="360"/>
+        <w:jc w:val="both"/>
+        <w:rPr>
+          <w:rFonts w:asciiTheme="majorHAnsi" w:hAnsiTheme="majorHAnsi" w:cstheme="majorHAnsi"/>
+          <w:sz w:val="22"/>
+          <w:szCs w:val="22"/>
+        </w:rPr>
+      </w:pPr>
+      <w:r>
+        <w:rPr>
+          <w:rFonts w:asciiTheme="majorHAnsi" w:hAnsiTheme="majorHAnsi" w:cstheme="majorHAnsi"/>
+          <w:sz w:val="22"/>
+          <w:szCs w:val="22"/>
+        </w:rPr>
+        <w:t>This document defines the functional requirements of the Wildcat’s DEN system. It serves as a guide for developers, designers, and stakeholders to understand the expected behavior and features of the system.</w:t>
+      </w:r>
     </w:p>
     <w:p>
       <w:pPr>
@@ -2222,19 +2281,38 @@
           <w:numId w:val="10"/>
         </w:numPr>
         <w:ind w:right="432"/>
+        <w:jc w:val="both"/>
+        <w:rPr>
+          <w:rFonts w:cstheme="majorHAnsi"/>
+        </w:rPr>
       </w:pPr>
       <w:bookmarkStart w:id="2" w:name="_Toc220513506"/>
       <w:r>
+        <w:rPr>
+          <w:rFonts w:cstheme="majorHAnsi"/>
+        </w:rPr>
         <w:t>Scope</w:t>
       </w:r>
       <w:bookmarkEnd w:id="2"/>
     </w:p>
     <w:p>
       <w:pPr>
+        <w:pStyle w:val="NormalWeb"/>
         <w:ind w:left="360"/>
-      </w:pPr>
+        <w:rPr>
+          <w:rFonts w:asciiTheme="majorHAnsi" w:hAnsiTheme="majorHAnsi" w:cstheme="majorHAnsi"/>
+          <w:sz w:val="22"/>
+          <w:szCs w:val="22"/>
+        </w:rPr>
+      </w:pPr>
+      <w:bookmarkStart w:id="3" w:name="_Toc220513507"/>
       <w:r>
-        <w:t>Describe what the system will do and its boundaries.</w:t>
+        <w:rPr>
+          <w:rFonts w:asciiTheme="majorHAnsi" w:hAnsiTheme="majorHAnsi" w:cstheme="majorHAnsi"/>
+          <w:sz w:val="22"/>
+          <w:szCs w:val="22"/>
+        </w:rPr>
+        <w:t>Wildcat’s DEN is a web-based and mobile-supported venue booking system designed for students, faculty, and event organizers within CIT-U. The system allows users to browse venues, check availability, and book venues efficiently. It also provides administrative tools for managing venues and bookings.</w:t>
       </w:r>
     </w:p>
     <w:p>
@@ -2245,19 +2323,148 @@
           <w:numId w:val="10"/>
         </w:numPr>
         <w:ind w:right="432"/>
-      </w:pPr>
-      <w:bookmarkStart w:id="3" w:name="_Toc220513507"/>
+        <w:jc w:val="both"/>
+        <w:rPr>
+          <w:rFonts w:cstheme="majorHAnsi"/>
+        </w:rPr>
+      </w:pPr>
       <w:r>
+        <w:rPr>
+          <w:rFonts w:cstheme="majorHAnsi"/>
+        </w:rPr>
         <w:t>Definitions, Acronyms, and Abbreviations</w:t>
       </w:r>
       <w:bookmarkEnd w:id="3"/>
     </w:p>
     <w:p>
       <w:pPr>
-        <w:ind w:left="360"/>
-      </w:pPr>
+        <w:numPr>
+          <w:ilvl w:val="0"/>
+          <w:numId w:val="13"/>
+        </w:numPr>
+        <w:spacing w:before="100" w:beforeAutospacing="1" w:after="100" w:afterAutospacing="1" w:line="240" w:lineRule="auto"/>
+        <w:rPr>
+          <w:rFonts w:asciiTheme="majorHAnsi" w:eastAsia="Times New Roman" w:hAnsiTheme="majorHAnsi" w:cstheme="majorHAnsi"/>
+        </w:rPr>
+      </w:pPr>
+      <w:bookmarkStart w:id="4" w:name="_Toc220513508"/>
       <w:r>
-        <w:t>List and define important terms used in this document.</w:t>
+        <w:rPr>
+          <w:rFonts w:asciiTheme="majorHAnsi" w:eastAsia="Times New Roman" w:hAnsiTheme="majorHAnsi" w:cstheme="majorHAnsi"/>
+          <w:b/>
+          <w:bCs/>
+        </w:rPr>
+        <w:t>API</w:t>
+      </w:r>
+      <w:r>
+        <w:rPr>
+          <w:rFonts w:asciiTheme="majorHAnsi" w:eastAsia="Times New Roman" w:hAnsiTheme="majorHAnsi" w:cstheme="majorHAnsi"/>
+        </w:rPr>
+        <w:t xml:space="preserve"> – Application Programming Interface </w:t>
+      </w:r>
+    </w:p>
+    <w:p>
+      <w:pPr>
+        <w:numPr>
+          <w:ilvl w:val="0"/>
+          <w:numId w:val="13"/>
+        </w:numPr>
+        <w:spacing w:before="100" w:beforeAutospacing="1" w:after="100" w:afterAutospacing="1" w:line="240" w:lineRule="auto"/>
+        <w:rPr>
+          <w:rFonts w:asciiTheme="majorHAnsi" w:eastAsia="Times New Roman" w:hAnsiTheme="majorHAnsi" w:cstheme="majorHAnsi"/>
+        </w:rPr>
+      </w:pPr>
+      <w:r>
+        <w:rPr>
+          <w:rFonts w:asciiTheme="majorHAnsi" w:eastAsia="Times New Roman" w:hAnsiTheme="majorHAnsi" w:cstheme="majorHAnsi"/>
+          <w:b/>
+          <w:bCs/>
+        </w:rPr>
+        <w:t>JWT</w:t>
+      </w:r>
+      <w:r>
+        <w:rPr>
+          <w:rFonts w:asciiTheme="majorHAnsi" w:eastAsia="Times New Roman" w:hAnsiTheme="majorHAnsi" w:cstheme="majorHAnsi"/>
+        </w:rPr>
+        <w:t xml:space="preserve"> – JSON Web Token </w:t>
+      </w:r>
+    </w:p>
+    <w:p>
+      <w:pPr>
+        <w:numPr>
+          <w:ilvl w:val="0"/>
+          <w:numId w:val="13"/>
+        </w:numPr>
+        <w:spacing w:before="100" w:beforeAutospacing="1" w:after="100" w:afterAutospacing="1" w:line="240" w:lineRule="auto"/>
+        <w:rPr>
+          <w:rFonts w:asciiTheme="majorHAnsi" w:eastAsia="Times New Roman" w:hAnsiTheme="majorHAnsi" w:cstheme="majorHAnsi"/>
+        </w:rPr>
+      </w:pPr>
+      <w:r>
+        <w:rPr>
+          <w:rFonts w:asciiTheme="majorHAnsi" w:eastAsia="Times New Roman" w:hAnsiTheme="majorHAnsi" w:cstheme="majorHAnsi"/>
+          <w:b/>
+          <w:bCs/>
+        </w:rPr>
+        <w:t>CRUD</w:t>
+      </w:r>
+      <w:r>
+        <w:rPr>
+          <w:rFonts w:asciiTheme="majorHAnsi" w:eastAsia="Times New Roman" w:hAnsiTheme="majorHAnsi" w:cstheme="majorHAnsi"/>
+        </w:rPr>
+        <w:t xml:space="preserve"> – Create, Read, Update, Delete </w:t>
+      </w:r>
+    </w:p>
+    <w:p>
+      <w:pPr>
+        <w:numPr>
+          <w:ilvl w:val="0"/>
+          <w:numId w:val="13"/>
+        </w:numPr>
+        <w:spacing w:before="100" w:beforeAutospacing="1" w:after="100" w:afterAutospacing="1" w:line="240" w:lineRule="auto"/>
+        <w:rPr>
+          <w:rFonts w:asciiTheme="majorHAnsi" w:eastAsia="Times New Roman" w:hAnsiTheme="majorHAnsi" w:cstheme="majorHAnsi"/>
+        </w:rPr>
+      </w:pPr>
+      <w:r>
+        <w:rPr>
+          <w:rFonts w:asciiTheme="majorHAnsi" w:eastAsia="Times New Roman" w:hAnsiTheme="majorHAnsi" w:cstheme="majorHAnsi"/>
+          <w:b/>
+          <w:bCs/>
+        </w:rPr>
+        <w:t>UI</w:t>
+      </w:r>
+      <w:r>
+        <w:rPr>
+          <w:rFonts w:asciiTheme="majorHAnsi" w:eastAsia="Times New Roman" w:hAnsiTheme="majorHAnsi" w:cstheme="majorHAnsi"/>
+        </w:rPr>
+        <w:t xml:space="preserve"> – User Interface </w:t>
+      </w:r>
+    </w:p>
+    <w:p>
+      <w:pPr>
+        <w:numPr>
+          <w:ilvl w:val="0"/>
+          <w:numId w:val="13"/>
+        </w:numPr>
+        <w:spacing w:before="100" w:beforeAutospacing="1" w:after="100" w:afterAutospacing="1" w:line="240" w:lineRule="auto"/>
+        <w:rPr>
+          <w:rFonts w:asciiTheme="majorHAnsi" w:eastAsia="Times New Roman" w:hAnsiTheme="majorHAnsi" w:cstheme="majorHAnsi"/>
+        </w:rPr>
+      </w:pPr>
+      <w:r>
+        <w:rPr>
+          <w:rFonts w:asciiTheme="majorHAnsi" w:eastAsia="Times New Roman" w:hAnsiTheme="majorHAnsi" w:cstheme="majorHAnsi"/>
+          <w:b/>
+          <w:bCs/>
+        </w:rPr>
+        <w:t>UX</w:t>
+      </w:r>
+      <w:r>
+        <w:rPr>
+          <w:rFonts w:asciiTheme="majorHAnsi" w:eastAsia="Times New Roman" w:hAnsiTheme="majorHAnsi" w:cstheme="majorHAnsi"/>
+        </w:rPr>
+        <w:t xml:space="preserve"> – User Experience </w:t>
       </w:r>
     </w:p>
     <w:p>
@@ -2267,9 +2474,19 @@
           <w:ilvl w:val="0"/>
           <w:numId w:val="10"/>
         </w:numPr>
-      </w:pPr>
-      <w:bookmarkStart w:id="4" w:name="_Toc220513508"/>
+        <w:jc w:val="both"/>
+        <w:rPr>
+          <w:rFonts w:cstheme="majorHAnsi"/>
+          <w:sz w:val="22"/>
+          <w:szCs w:val="22"/>
+        </w:rPr>
+      </w:pPr>
       <w:r>
+        <w:rPr>
+          <w:rFonts w:cstheme="majorHAnsi"/>
+          <w:sz w:val="22"/>
+          <w:szCs w:val="22"/>
+        </w:rPr>
         <w:t>Overall Description</w:t>
       </w:r>
       <w:bookmarkEnd w:id="4"/>
@@ -2281,19 +2498,103 @@
           <w:ilvl w:val="1"/>
           <w:numId w:val="10"/>
         </w:numPr>
+        <w:jc w:val="both"/>
+        <w:rPr>
+          <w:rFonts w:cstheme="majorHAnsi"/>
+        </w:rPr>
       </w:pPr>
       <w:bookmarkStart w:id="5" w:name="_Toc220513509"/>
       <w:r>
+        <w:rPr>
+          <w:rFonts w:cstheme="majorHAnsi"/>
+        </w:rPr>
         <w:t>System Perspective</w:t>
       </w:r>
       <w:bookmarkEnd w:id="5"/>
     </w:p>
     <w:p>
       <w:pPr>
+        <w:spacing w:before="100" w:beforeAutospacing="1" w:after="100" w:afterAutospacing="1" w:line="240" w:lineRule="auto"/>
         <w:ind w:left="360"/>
-      </w:pPr>
+        <w:rPr>
+          <w:rFonts w:asciiTheme="majorHAnsi" w:eastAsia="Times New Roman" w:hAnsiTheme="majorHAnsi" w:cstheme="majorHAnsi"/>
+        </w:rPr>
+      </w:pPr>
+      <w:bookmarkStart w:id="6" w:name="_Toc220513510"/>
       <w:r>
-        <w:t>Describe how the system fits into a larger context or environment.</w:t>
+        <w:rPr>
+          <w:rFonts w:asciiTheme="majorHAnsi" w:eastAsia="Times New Roman" w:hAnsiTheme="majorHAnsi" w:cstheme="majorHAnsi"/>
+        </w:rPr>
+        <w:t>The system follows a three-tier architecture consisting of:</w:t>
+      </w:r>
+    </w:p>
+    <w:p>
+      <w:pPr>
+        <w:numPr>
+          <w:ilvl w:val="0"/>
+          <w:numId w:val="14"/>
+        </w:numPr>
+        <w:tabs>
+          <w:tab w:val="clear" w:pos="720"/>
+          <w:tab w:val="num" w:pos="1080"/>
+        </w:tabs>
+        <w:spacing w:before="100" w:beforeAutospacing="1" w:after="100" w:afterAutospacing="1" w:line="240" w:lineRule="auto"/>
+        <w:ind w:left="1080"/>
+        <w:rPr>
+          <w:rFonts w:asciiTheme="majorHAnsi" w:eastAsia="Times New Roman" w:hAnsiTheme="majorHAnsi" w:cstheme="majorHAnsi"/>
+        </w:rPr>
+      </w:pPr>
+      <w:r>
+        <w:rPr>
+          <w:rFonts w:asciiTheme="majorHAnsi" w:eastAsia="Times New Roman" w:hAnsiTheme="majorHAnsi" w:cstheme="majorHAnsi"/>
+        </w:rPr>
+        <w:t xml:space="preserve">Frontend (React Web and Android Mobile App) </w:t>
+      </w:r>
+    </w:p>
+    <w:p>
+      <w:pPr>
+        <w:numPr>
+          <w:ilvl w:val="0"/>
+          <w:numId w:val="14"/>
+        </w:numPr>
+        <w:tabs>
+          <w:tab w:val="clear" w:pos="720"/>
+          <w:tab w:val="num" w:pos="1080"/>
+        </w:tabs>
+        <w:spacing w:before="100" w:beforeAutospacing="1" w:after="100" w:afterAutospacing="1" w:line="240" w:lineRule="auto"/>
+        <w:ind w:left="1080"/>
+        <w:rPr>
+          <w:rFonts w:asciiTheme="majorHAnsi" w:eastAsia="Times New Roman" w:hAnsiTheme="majorHAnsi" w:cstheme="majorHAnsi"/>
+        </w:rPr>
+      </w:pPr>
+      <w:r>
+        <w:rPr>
+          <w:rFonts w:asciiTheme="majorHAnsi" w:eastAsia="Times New Roman" w:hAnsiTheme="majorHAnsi" w:cstheme="majorHAnsi"/>
+        </w:rPr>
+        <w:t xml:space="preserve">Backend (Spring Boot API) </w:t>
+      </w:r>
+    </w:p>
+    <w:p>
+      <w:pPr>
+        <w:numPr>
+          <w:ilvl w:val="0"/>
+          <w:numId w:val="14"/>
+        </w:numPr>
+        <w:tabs>
+          <w:tab w:val="clear" w:pos="720"/>
+          <w:tab w:val="num" w:pos="1080"/>
+        </w:tabs>
+        <w:spacing w:before="100" w:beforeAutospacing="1" w:after="100" w:afterAutospacing="1" w:line="240" w:lineRule="auto"/>
+        <w:ind w:left="1080"/>
+        <w:rPr>
+          <w:rFonts w:asciiTheme="majorHAnsi" w:eastAsia="Times New Roman" w:hAnsiTheme="majorHAnsi" w:cstheme="majorHAnsi"/>
+        </w:rPr>
+      </w:pPr>
+      <w:r>
+        <w:rPr>
+          <w:rFonts w:asciiTheme="majorHAnsi" w:eastAsia="Times New Roman" w:hAnsiTheme="majorHAnsi" w:cstheme="majorHAnsi"/>
+        </w:rPr>
+        <w:t>Database (PostgreSQL)</w:t>
       </w:r>
     </w:p>
     <w:p>
@@ -2303,19 +2604,117 @@
           <w:ilvl w:val="1"/>
           <w:numId w:val="10"/>
         </w:numPr>
-      </w:pPr>
-      <w:bookmarkStart w:id="6" w:name="_Toc220513510"/>
+        <w:jc w:val="both"/>
+        <w:rPr>
+          <w:rFonts w:cstheme="majorHAnsi"/>
+        </w:rPr>
+      </w:pPr>
       <w:r>
+        <w:rPr>
+          <w:rFonts w:cstheme="majorHAnsi"/>
+        </w:rPr>
         <w:t>User Classes and Characteristics</w:t>
       </w:r>
       <w:bookmarkEnd w:id="6"/>
     </w:p>
     <w:p>
       <w:pPr>
-        <w:ind w:left="360"/>
+        <w:pStyle w:val="ListParagraph"/>
+        <w:numPr>
+          <w:ilvl w:val="0"/>
+          <w:numId w:val="15"/>
+        </w:numPr>
+        <w:spacing w:after="0" w:line="240" w:lineRule="auto"/>
+        <w:rPr>
+          <w:rFonts w:asciiTheme="majorHAnsi" w:eastAsia="Times New Roman" w:hAnsiTheme="majorHAnsi" w:cstheme="majorHAnsi"/>
+        </w:rPr>
       </w:pPr>
       <w:r>
-        <w:t>Identify the different types of users and their characteristics.</w:t>
+        <w:rPr>
+          <w:rFonts w:asciiTheme="majorHAnsi" w:eastAsia="Times New Roman" w:hAnsiTheme="majorHAnsi" w:cstheme="majorHAnsi"/>
+        </w:rPr>
+        <w:t>Students</w:t>
+      </w:r>
+      <w:r>
+        <w:rPr>
+          <w:rFonts w:asciiTheme="majorHAnsi" w:eastAsia="Times New Roman" w:hAnsiTheme="majorHAnsi" w:cstheme="majorHAnsi"/>
+        </w:rPr>
+        <w:t xml:space="preserve"> – Basic users who can browse and book venues </w:t>
+      </w:r>
+    </w:p>
+    <w:p>
+      <w:pPr>
+        <w:pStyle w:val="ListParagraph"/>
+        <w:numPr>
+          <w:ilvl w:val="0"/>
+          <w:numId w:val="15"/>
+        </w:numPr>
+        <w:spacing w:after="0" w:line="240" w:lineRule="auto"/>
+        <w:rPr>
+          <w:rFonts w:asciiTheme="majorHAnsi" w:eastAsia="Times New Roman" w:hAnsiTheme="majorHAnsi" w:cstheme="majorHAnsi"/>
+        </w:rPr>
+      </w:pPr>
+      <w:r>
+        <w:rPr>
+          <w:rFonts w:asciiTheme="majorHAnsi" w:eastAsia="Times New Roman" w:hAnsiTheme="majorHAnsi" w:cstheme="majorHAnsi"/>
+        </w:rPr>
+        <w:t>Faculty</w:t>
+      </w:r>
+      <w:r>
+        <w:rPr>
+          <w:rFonts w:asciiTheme="majorHAnsi" w:eastAsia="Times New Roman" w:hAnsiTheme="majorHAnsi" w:cstheme="majorHAnsi"/>
+        </w:rPr>
+        <w:t xml:space="preserve"> – Users with similar privileges as students </w:t>
+      </w:r>
+    </w:p>
+    <w:p>
+      <w:pPr>
+        <w:pStyle w:val="ListParagraph"/>
+        <w:numPr>
+          <w:ilvl w:val="0"/>
+          <w:numId w:val="15"/>
+        </w:numPr>
+        <w:spacing w:after="0" w:line="240" w:lineRule="auto"/>
+        <w:rPr>
+          <w:rFonts w:asciiTheme="majorHAnsi" w:eastAsia="Times New Roman" w:hAnsiTheme="majorHAnsi" w:cstheme="majorHAnsi"/>
+        </w:rPr>
+      </w:pPr>
+      <w:r>
+        <w:rPr>
+          <w:rFonts w:asciiTheme="majorHAnsi" w:eastAsia="Times New Roman" w:hAnsiTheme="majorHAnsi" w:cstheme="majorHAnsi"/>
+        </w:rPr>
+        <w:t>Organizers</w:t>
+      </w:r>
+      <w:r>
+        <w:rPr>
+          <w:rFonts w:asciiTheme="majorHAnsi" w:eastAsia="Times New Roman" w:hAnsiTheme="majorHAnsi" w:cstheme="majorHAnsi"/>
+        </w:rPr>
+        <w:t xml:space="preserve"> – External users who manage event bookings </w:t>
+      </w:r>
+    </w:p>
+    <w:p>
+      <w:pPr>
+        <w:pStyle w:val="ListParagraph"/>
+        <w:numPr>
+          <w:ilvl w:val="0"/>
+          <w:numId w:val="15"/>
+        </w:numPr>
+        <w:jc w:val="both"/>
+        <w:rPr>
+          <w:rFonts w:asciiTheme="majorHAnsi" w:hAnsiTheme="majorHAnsi" w:cstheme="majorHAnsi"/>
+        </w:rPr>
+      </w:pPr>
+      <w:r>
+        <w:rPr>
+          <w:rFonts w:asciiTheme="majorHAnsi" w:eastAsia="Times New Roman" w:hAnsiTheme="majorHAnsi" w:cstheme="majorHAnsi"/>
+        </w:rPr>
+        <w:t>Administrators</w:t>
+      </w:r>
+      <w:r>
+        <w:rPr>
+          <w:rFonts w:asciiTheme="majorHAnsi" w:eastAsia="Times New Roman" w:hAnsiTheme="majorHAnsi" w:cstheme="majorHAnsi"/>
+        </w:rPr>
+        <w:t xml:space="preserve"> – Manage venues, bookings, and users</w:t>
       </w:r>
     </w:p>
     <w:p>
@@ -2325,19 +2724,90 @@
           <w:ilvl w:val="1"/>
           <w:numId w:val="10"/>
         </w:numPr>
+        <w:jc w:val="both"/>
+        <w:rPr>
+          <w:rFonts w:cstheme="majorHAnsi"/>
+        </w:rPr>
       </w:pPr>
       <w:bookmarkStart w:id="7" w:name="_Toc220513511"/>
       <w:r>
+        <w:rPr>
+          <w:rFonts w:cstheme="majorHAnsi"/>
+        </w:rPr>
         <w:t>Operating Environment</w:t>
       </w:r>
       <w:bookmarkEnd w:id="7"/>
     </w:p>
     <w:p>
       <w:pPr>
-        <w:ind w:left="360"/>
+        <w:pStyle w:val="ListParagraph"/>
+        <w:numPr>
+          <w:ilvl w:val="0"/>
+          <w:numId w:val="18"/>
+        </w:numPr>
+        <w:rPr>
+          <w:rFonts w:asciiTheme="majorHAnsi" w:hAnsiTheme="majorHAnsi" w:cstheme="majorHAnsi"/>
+        </w:rPr>
       </w:pPr>
       <w:r>
-        <w:t>Specify the hardware, software, and tools required to operate the system.</w:t>
+        <w:rPr>
+          <w:rFonts w:asciiTheme="majorHAnsi" w:hAnsiTheme="majorHAnsi" w:cstheme="majorHAnsi"/>
+        </w:rPr>
+        <w:t>Web browsers (Chrome, Firefox, Safari, Edge)</w:t>
+      </w:r>
+    </w:p>
+    <w:p>
+      <w:pPr>
+        <w:pStyle w:val="ListParagraph"/>
+        <w:numPr>
+          <w:ilvl w:val="0"/>
+          <w:numId w:val="18"/>
+        </w:numPr>
+        <w:rPr>
+          <w:rFonts w:asciiTheme="majorHAnsi" w:hAnsiTheme="majorHAnsi" w:cstheme="majorHAnsi"/>
+        </w:rPr>
+      </w:pPr>
+      <w:r>
+        <w:rPr>
+          <w:rFonts w:asciiTheme="majorHAnsi" w:hAnsiTheme="majorHAnsi" w:cstheme="majorHAnsi"/>
+        </w:rPr>
+        <w:t>Android devices (Android 7.0+)</w:t>
+      </w:r>
+    </w:p>
+    <w:p>
+      <w:pPr>
+        <w:pStyle w:val="ListParagraph"/>
+        <w:numPr>
+          <w:ilvl w:val="0"/>
+          <w:numId w:val="18"/>
+        </w:numPr>
+        <w:rPr>
+          <w:rFonts w:asciiTheme="majorHAnsi" w:hAnsiTheme="majorHAnsi" w:cstheme="majorHAnsi"/>
+        </w:rPr>
+      </w:pPr>
+      <w:r>
+        <w:rPr>
+          <w:rFonts w:asciiTheme="majorHAnsi" w:hAnsiTheme="majorHAnsi" w:cstheme="majorHAnsi"/>
+        </w:rPr>
+        <w:t>Backend server (Spring Boot)</w:t>
+      </w:r>
+    </w:p>
+    <w:p>
+      <w:pPr>
+        <w:pStyle w:val="ListParagraph"/>
+        <w:numPr>
+          <w:ilvl w:val="0"/>
+          <w:numId w:val="18"/>
+        </w:numPr>
+        <w:rPr>
+          <w:rFonts w:asciiTheme="majorHAnsi" w:hAnsiTheme="majorHAnsi" w:cstheme="majorHAnsi"/>
+        </w:rPr>
+      </w:pPr>
+      <w:r>
+        <w:rPr>
+          <w:rFonts w:asciiTheme="majorHAnsi" w:hAnsiTheme="majorHAnsi" w:cstheme="majorHAnsi"/>
+        </w:rPr>
+        <w:t>PostgreSQL database</w:t>
       </w:r>
     </w:p>
     <w:p>
@@ -2347,19 +2817,92 @@
           <w:ilvl w:val="1"/>
           <w:numId w:val="10"/>
         </w:numPr>
+        <w:jc w:val="both"/>
+        <w:rPr>
+          <w:rFonts w:cstheme="majorHAnsi"/>
+        </w:rPr>
       </w:pPr>
       <w:bookmarkStart w:id="8" w:name="_Toc220513512"/>
       <w:r>
+        <w:rPr>
+          <w:rFonts w:cstheme="majorHAnsi"/>
+        </w:rPr>
+        <w:lastRenderedPageBreak/>
         <w:t>Assumptions and Dependencies</w:t>
       </w:r>
       <w:bookmarkEnd w:id="8"/>
     </w:p>
     <w:p>
       <w:pPr>
-        <w:ind w:left="360"/>
-      </w:pPr>
+        <w:numPr>
+          <w:ilvl w:val="0"/>
+          <w:numId w:val="20"/>
+        </w:numPr>
+        <w:spacing w:before="100" w:beforeAutospacing="1" w:after="100" w:afterAutospacing="1" w:line="240" w:lineRule="auto"/>
+        <w:rPr>
+          <w:rFonts w:asciiTheme="majorHAnsi" w:eastAsia="Times New Roman" w:hAnsiTheme="majorHAnsi" w:cstheme="majorHAnsi"/>
+        </w:rPr>
+      </w:pPr>
+      <w:bookmarkStart w:id="9" w:name="_Toc220513513"/>
       <w:r>
-        <w:t>List any assumptions and external dependencies that may affect the system.</w:t>
+        <w:rPr>
+          <w:rFonts w:asciiTheme="majorHAnsi" w:eastAsia="Times New Roman" w:hAnsiTheme="majorHAnsi" w:cstheme="majorHAnsi"/>
+        </w:rPr>
+        <w:t xml:space="preserve">Users have internet access </w:t>
+      </w:r>
+    </w:p>
+    <w:p>
+      <w:pPr>
+        <w:numPr>
+          <w:ilvl w:val="0"/>
+          <w:numId w:val="20"/>
+        </w:numPr>
+        <w:spacing w:before="100" w:beforeAutospacing="1" w:after="100" w:afterAutospacing="1" w:line="240" w:lineRule="auto"/>
+        <w:rPr>
+          <w:rFonts w:asciiTheme="majorHAnsi" w:eastAsia="Times New Roman" w:hAnsiTheme="majorHAnsi" w:cstheme="majorHAnsi"/>
+        </w:rPr>
+      </w:pPr>
+      <w:r>
+        <w:rPr>
+          <w:rFonts w:asciiTheme="majorHAnsi" w:eastAsia="Times New Roman" w:hAnsiTheme="majorHAnsi" w:cstheme="majorHAnsi"/>
+        </w:rPr>
+        <w:t xml:space="preserve">System relies on REST API availability </w:t>
+      </w:r>
+    </w:p>
+    <w:p>
+      <w:pPr>
+        <w:numPr>
+          <w:ilvl w:val="0"/>
+          <w:numId w:val="20"/>
+        </w:numPr>
+        <w:spacing w:before="100" w:beforeAutospacing="1" w:after="100" w:afterAutospacing="1" w:line="240" w:lineRule="auto"/>
+        <w:rPr>
+          <w:rFonts w:asciiTheme="majorHAnsi" w:eastAsia="Times New Roman" w:hAnsiTheme="majorHAnsi" w:cstheme="majorHAnsi"/>
+        </w:rPr>
+      </w:pPr>
+      <w:r>
+        <w:rPr>
+          <w:rFonts w:asciiTheme="majorHAnsi" w:eastAsia="Times New Roman" w:hAnsiTheme="majorHAnsi" w:cstheme="majorHAnsi"/>
+        </w:rPr>
+        <w:t xml:space="preserve">Database server is continuously accessible </w:t>
+      </w:r>
+    </w:p>
+    <w:p>
+      <w:pPr>
+        <w:numPr>
+          <w:ilvl w:val="0"/>
+          <w:numId w:val="20"/>
+        </w:numPr>
+        <w:spacing w:before="100" w:beforeAutospacing="1" w:after="100" w:afterAutospacing="1" w:line="240" w:lineRule="auto"/>
+        <w:rPr>
+          <w:rFonts w:asciiTheme="majorHAnsi" w:eastAsia="Times New Roman" w:hAnsiTheme="majorHAnsi" w:cstheme="majorHAnsi"/>
+        </w:rPr>
+      </w:pPr>
+      <w:r>
+        <w:rPr>
+          <w:rFonts w:asciiTheme="majorHAnsi" w:eastAsia="Times New Roman" w:hAnsiTheme="majorHAnsi" w:cstheme="majorHAnsi"/>
+        </w:rPr>
+        <w:t xml:space="preserve">Authentication depends on JWT tokens </w:t>
       </w:r>
     </w:p>
     <w:p>
@@ -2369,9 +2912,19 @@
           <w:ilvl w:val="0"/>
           <w:numId w:val="10"/>
         </w:numPr>
-      </w:pPr>
-      <w:bookmarkStart w:id="9" w:name="_Toc220513513"/>
+        <w:jc w:val="both"/>
+        <w:rPr>
+          <w:rFonts w:cstheme="majorHAnsi"/>
+          <w:sz w:val="22"/>
+          <w:szCs w:val="22"/>
+        </w:rPr>
+      </w:pPr>
       <w:r>
+        <w:rPr>
+          <w:rFonts w:cstheme="majorHAnsi"/>
+          <w:sz w:val="22"/>
+          <w:szCs w:val="22"/>
+        </w:rPr>
         <w:t>System Features and Functional Requirements</w:t>
       </w:r>
       <w:bookmarkEnd w:id="9"/>
@@ -2379,8 +2932,15 @@
     <w:p>
       <w:pPr>
         <w:ind w:left="360"/>
+        <w:jc w:val="both"/>
+        <w:rPr>
+          <w:rFonts w:asciiTheme="majorHAnsi" w:hAnsiTheme="majorHAnsi" w:cstheme="majorHAnsi"/>
+        </w:rPr>
       </w:pPr>
       <w:r>
+        <w:rPr>
+          <w:rFonts w:asciiTheme="majorHAnsi" w:hAnsiTheme="majorHAnsi" w:cstheme="majorHAnsi"/>
+        </w:rPr>
         <w:t>Describe each major feature of the system and its functional requirements.</w:t>
       </w:r>
     </w:p>
@@ -2391,35 +2951,153 @@
           <w:ilvl w:val="1"/>
           <w:numId w:val="10"/>
         </w:numPr>
+        <w:jc w:val="both"/>
+        <w:rPr>
+          <w:rFonts w:cstheme="majorHAnsi"/>
+        </w:rPr>
       </w:pPr>
       <w:bookmarkStart w:id="10" w:name="_Toc220513514"/>
       <w:r>
+        <w:rPr>
+          <w:rFonts w:cstheme="majorHAnsi"/>
+        </w:rPr>
         <w:t>Feature 1:</w:t>
       </w:r>
       <w:bookmarkEnd w:id="10"/>
+      <w:r>
+        <w:rPr>
+          <w:rFonts w:cstheme="majorHAnsi"/>
+        </w:rPr>
+        <w:t xml:space="preserve"> </w:t>
+      </w:r>
+      <w:r>
+        <w:rPr>
+          <w:rFonts w:cstheme="majorHAnsi"/>
+        </w:rPr>
+        <w:t>User Authentication</w:t>
+      </w:r>
     </w:p>
     <w:p>
       <w:pPr>
         <w:ind w:left="360"/>
+        <w:rPr>
+          <w:rFonts w:asciiTheme="majorHAnsi" w:hAnsiTheme="majorHAnsi" w:cstheme="majorHAnsi"/>
+        </w:rPr>
       </w:pPr>
       <w:r>
+        <w:rPr>
+          <w:rFonts w:asciiTheme="majorHAnsi" w:hAnsiTheme="majorHAnsi" w:cstheme="majorHAnsi"/>
+        </w:rPr>
         <w:t>Description:</w:t>
       </w:r>
       <w:r>
+        <w:rPr>
+          <w:rFonts w:asciiTheme="majorHAnsi" w:hAnsiTheme="majorHAnsi" w:cstheme="majorHAnsi"/>
+        </w:rPr>
+        <w:t xml:space="preserve"> </w:t>
+      </w:r>
+      <w:r>
+        <w:rPr>
+          <w:rFonts w:asciiTheme="majorHAnsi" w:hAnsiTheme="majorHAnsi" w:cstheme="majorHAnsi"/>
+        </w:rPr>
+        <w:t>Allows users to register, log in, and log out securely using email and password.</w:t>
+      </w:r>
+      <w:r>
+        <w:rPr>
+          <w:rFonts w:asciiTheme="majorHAnsi" w:hAnsiTheme="majorHAnsi" w:cstheme="majorHAnsi"/>
+        </w:rPr>
         <w:br/>
         <w:t>Functional Requirements:</w:t>
       </w:r>
+    </w:p>
+    <w:p>
+      <w:pPr>
+        <w:pStyle w:val="ListParagraph"/>
+        <w:numPr>
+          <w:ilvl w:val="0"/>
+          <w:numId w:val="22"/>
+        </w:numPr>
+        <w:rPr>
+          <w:rFonts w:asciiTheme="majorHAnsi" w:hAnsiTheme="majorHAnsi" w:cstheme="majorHAnsi"/>
+        </w:rPr>
+      </w:pPr>
       <w:r>
-        <w:br/>
-        <w:t xml:space="preserve">- </w:t>
+        <w:rPr>
+          <w:rFonts w:asciiTheme="majorHAnsi" w:hAnsiTheme="majorHAnsi" w:cstheme="majorHAnsi"/>
+        </w:rPr>
+        <w:t xml:space="preserve"> Users can register with email, password, first name, and last name </w:t>
       </w:r>
+    </w:p>
+    <w:p>
+      <w:pPr>
+        <w:pStyle w:val="ListParagraph"/>
+        <w:numPr>
+          <w:ilvl w:val="0"/>
+          <w:numId w:val="21"/>
+        </w:numPr>
+        <w:rPr>
+          <w:rFonts w:asciiTheme="majorHAnsi" w:hAnsiTheme="majorHAnsi" w:cstheme="majorHAnsi"/>
+        </w:rPr>
+      </w:pPr>
       <w:r>
-        <w:br/>
-        <w:t xml:space="preserve">- </w:t>
+        <w:rPr>
+          <w:rFonts w:asciiTheme="majorHAnsi" w:hAnsiTheme="majorHAnsi" w:cstheme="majorHAnsi"/>
+        </w:rPr>
+        <w:t xml:space="preserve">System validates email format and password strength </w:t>
       </w:r>
+    </w:p>
+    <w:p>
+      <w:pPr>
+        <w:pStyle w:val="ListParagraph"/>
+        <w:numPr>
+          <w:ilvl w:val="0"/>
+          <w:numId w:val="21"/>
+        </w:numPr>
+        <w:rPr>
+          <w:rFonts w:asciiTheme="majorHAnsi" w:hAnsiTheme="majorHAnsi" w:cstheme="majorHAnsi"/>
+        </w:rPr>
+      </w:pPr>
       <w:r>
-        <w:br/>
-        <w:t xml:space="preserve">- </w:t>
+        <w:rPr>
+          <w:rFonts w:asciiTheme="majorHAnsi" w:hAnsiTheme="majorHAnsi" w:cstheme="majorHAnsi"/>
+        </w:rPr>
+        <w:t xml:space="preserve">Users can log in using registered credentials </w:t>
+      </w:r>
+    </w:p>
+    <w:p>
+      <w:pPr>
+        <w:pStyle w:val="ListParagraph"/>
+        <w:numPr>
+          <w:ilvl w:val="0"/>
+          <w:numId w:val="21"/>
+        </w:numPr>
+        <w:rPr>
+          <w:rFonts w:asciiTheme="majorHAnsi" w:hAnsiTheme="majorHAnsi" w:cstheme="majorHAnsi"/>
+        </w:rPr>
+      </w:pPr>
+      <w:r>
+        <w:rPr>
+          <w:rFonts w:asciiTheme="majorHAnsi" w:hAnsiTheme="majorHAnsi" w:cstheme="majorHAnsi"/>
+        </w:rPr>
+        <w:t xml:space="preserve">System generates JWT tokens upon successful login </w:t>
+      </w:r>
+    </w:p>
+    <w:p>
+      <w:pPr>
+        <w:pStyle w:val="ListParagraph"/>
+        <w:numPr>
+          <w:ilvl w:val="0"/>
+          <w:numId w:val="21"/>
+        </w:numPr>
+        <w:rPr>
+          <w:rFonts w:asciiTheme="majorHAnsi" w:hAnsiTheme="majorHAnsi" w:cstheme="majorHAnsi"/>
+        </w:rPr>
+      </w:pPr>
+      <w:r>
+        <w:rPr>
+          <w:rFonts w:asciiTheme="majorHAnsi" w:hAnsiTheme="majorHAnsi" w:cstheme="majorHAnsi"/>
+        </w:rPr>
+        <w:t>Users can log out and terminate their session</w:t>
       </w:r>
     </w:p>
     <w:p>
@@ -2429,38 +3107,206 @@
           <w:ilvl w:val="1"/>
           <w:numId w:val="10"/>
         </w:numPr>
+        <w:rPr>
+          <w:rFonts w:cstheme="majorHAnsi"/>
+        </w:rPr>
       </w:pPr>
       <w:bookmarkStart w:id="11" w:name="_Toc220513515"/>
       <w:r>
+        <w:rPr>
+          <w:rFonts w:cstheme="majorHAnsi"/>
+        </w:rPr>
         <w:t>Feature 2:</w:t>
       </w:r>
       <w:bookmarkEnd w:id="11"/>
       <w:r>
+        <w:rPr>
+          <w:rFonts w:cstheme="majorHAnsi"/>
+        </w:rPr>
         <w:t xml:space="preserve"> </w:t>
       </w:r>
     </w:p>
     <w:p>
       <w:pPr>
         <w:ind w:left="360"/>
+        <w:rPr>
+          <w:rFonts w:asciiTheme="majorHAnsi" w:hAnsiTheme="majorHAnsi" w:cstheme="majorHAnsi"/>
+        </w:rPr>
       </w:pPr>
       <w:r>
+        <w:rPr>
+          <w:rFonts w:asciiTheme="majorHAnsi" w:hAnsiTheme="majorHAnsi" w:cstheme="majorHAnsi"/>
+        </w:rPr>
         <w:t>Description:</w:t>
       </w:r>
       <w:r>
+        <w:rPr>
+          <w:rFonts w:asciiTheme="majorHAnsi" w:hAnsiTheme="majorHAnsi" w:cstheme="majorHAnsi"/>
+        </w:rPr>
+        <w:t xml:space="preserve"> </w:t>
+      </w:r>
+      <w:r>
+        <w:rPr>
+          <w:rFonts w:asciiTheme="majorHAnsi" w:hAnsiTheme="majorHAnsi" w:cstheme="majorHAnsi"/>
+        </w:rPr>
+        <w:t>Enables users to browse venues, check availability, and book venues. Administrators manage venues and bookings.</w:t>
+      </w:r>
+      <w:r>
+        <w:rPr>
+          <w:rFonts w:asciiTheme="majorHAnsi" w:hAnsiTheme="majorHAnsi" w:cstheme="majorHAnsi"/>
+        </w:rPr>
         <w:br/>
         <w:t>Functional Requirements:</w:t>
       </w:r>
+    </w:p>
+    <w:p>
+      <w:pPr>
+        <w:pStyle w:val="ListParagraph"/>
+        <w:numPr>
+          <w:ilvl w:val="0"/>
+          <w:numId w:val="25"/>
+        </w:numPr>
+        <w:rPr>
+          <w:rFonts w:asciiTheme="majorHAnsi" w:hAnsiTheme="majorHAnsi" w:cstheme="majorHAnsi"/>
+        </w:rPr>
+      </w:pPr>
       <w:r>
-        <w:br/>
-        <w:t xml:space="preserve">- </w:t>
+        <w:rPr>
+          <w:rFonts w:asciiTheme="majorHAnsi" w:hAnsiTheme="majorHAnsi" w:cstheme="majorHAnsi"/>
+        </w:rPr>
+        <w:t>Users can view a list of available venues</w:t>
+      </w:r>
+    </w:p>
+    <w:p>
+      <w:pPr>
+        <w:pStyle w:val="ListParagraph"/>
+        <w:numPr>
+          <w:ilvl w:val="0"/>
+          <w:numId w:val="23"/>
+        </w:numPr>
+        <w:rPr>
+          <w:rFonts w:asciiTheme="majorHAnsi" w:hAnsiTheme="majorHAnsi" w:cstheme="majorHAnsi"/>
+        </w:rPr>
+      </w:pPr>
+      <w:r>
+        <w:rPr>
+          <w:rFonts w:asciiTheme="majorHAnsi" w:hAnsiTheme="majorHAnsi" w:cstheme="majorHAnsi"/>
+        </w:rPr>
+        <w:t>Users can search and filter venues</w:t>
+      </w:r>
+    </w:p>
+    <w:p>
+      <w:pPr>
+        <w:pStyle w:val="ListParagraph"/>
+        <w:numPr>
+          <w:ilvl w:val="0"/>
+          <w:numId w:val="23"/>
+        </w:numPr>
+        <w:rPr>
+          <w:rFonts w:asciiTheme="majorHAnsi" w:hAnsiTheme="majorHAnsi" w:cstheme="majorHAnsi"/>
+        </w:rPr>
+      </w:pPr>
+      <w:r>
+        <w:rPr>
+          <w:rFonts w:asciiTheme="majorHAnsi" w:hAnsiTheme="majorHAnsi" w:cstheme="majorHAnsi"/>
+        </w:rPr>
+        <w:t>Users can view venue details (capacity, amenities, schedule)</w:t>
+      </w:r>
+    </w:p>
+    <w:p>
+      <w:pPr>
+        <w:pStyle w:val="ListParagraph"/>
+        <w:numPr>
+          <w:ilvl w:val="0"/>
+          <w:numId w:val="23"/>
+        </w:numPr>
+        <w:rPr>
+          <w:rFonts w:asciiTheme="majorHAnsi" w:hAnsiTheme="majorHAnsi" w:cstheme="majorHAnsi"/>
+        </w:rPr>
+      </w:pPr>
+      <w:r>
+        <w:rPr>
+          <w:rFonts w:asciiTheme="majorHAnsi" w:hAnsiTheme="majorHAnsi" w:cstheme="majorHAnsi"/>
+        </w:rPr>
+        <w:t>Users can submit booking requests</w:t>
+      </w:r>
+    </w:p>
+    <w:p>
+      <w:pPr>
+        <w:pStyle w:val="ListParagraph"/>
+        <w:numPr>
+          <w:ilvl w:val="0"/>
+          <w:numId w:val="23"/>
+        </w:numPr>
+        <w:rPr>
+          <w:rFonts w:asciiTheme="majorHAnsi" w:hAnsiTheme="majorHAnsi" w:cstheme="majorHAnsi"/>
+        </w:rPr>
+      </w:pPr>
+      <w:r>
+        <w:rPr>
+          <w:rFonts w:asciiTheme="majorHAnsi" w:hAnsiTheme="majorHAnsi" w:cstheme="majorHAnsi"/>
+        </w:rPr>
+        <w:t>System validates booking availability</w:t>
+      </w:r>
+    </w:p>
+    <w:p>
+      <w:pPr>
+        <w:pStyle w:val="ListParagraph"/>
+        <w:numPr>
+          <w:ilvl w:val="0"/>
+          <w:numId w:val="23"/>
+        </w:numPr>
+        <w:rPr>
+          <w:rFonts w:asciiTheme="majorHAnsi" w:hAnsiTheme="majorHAnsi" w:cstheme="majorHAnsi"/>
+        </w:rPr>
+      </w:pPr>
+      <w:r>
+        <w:rPr>
+          <w:rFonts w:asciiTheme="majorHAnsi" w:hAnsiTheme="majorHAnsi" w:cstheme="majorHAnsi"/>
+        </w:rPr>
+        <w:t>Users can view booking history and cancel bookings</w:t>
+      </w:r>
+    </w:p>
+    <w:p>
+      <w:pPr>
+        <w:pStyle w:val="ListParagraph"/>
+        <w:numPr>
+          <w:ilvl w:val="0"/>
+          <w:numId w:val="23"/>
+        </w:numPr>
+        <w:rPr>
+          <w:rFonts w:asciiTheme="majorHAnsi" w:hAnsiTheme="majorHAnsi" w:cstheme="majorHAnsi"/>
+        </w:rPr>
+      </w:pPr>
+      <w:r>
+        <w:rPr>
+          <w:rFonts w:asciiTheme="majorHAnsi" w:hAnsiTheme="majorHAnsi" w:cstheme="majorHAnsi"/>
+        </w:rPr>
+        <w:t>Admins can approve or decline bookings</w:t>
+      </w:r>
+    </w:p>
+    <w:p>
+      <w:pPr>
+        <w:pStyle w:val="ListParagraph"/>
+        <w:numPr>
+          <w:ilvl w:val="0"/>
+          <w:numId w:val="23"/>
+        </w:numPr>
+        <w:rPr>
+          <w:rFonts w:asciiTheme="majorHAnsi" w:hAnsiTheme="majorHAnsi" w:cstheme="majorHAnsi"/>
+        </w:rPr>
+      </w:pPr>
+      <w:r>
+        <w:rPr>
+          <w:rFonts w:asciiTheme="majorHAnsi" w:hAnsiTheme="majorHAnsi" w:cstheme="majorHAnsi"/>
+        </w:rPr>
+        <w:t>Admins can add, edit, and delete venues</w:t>
       </w:r>
       <w:r>
-        <w:br/>
-        <w:t xml:space="preserve">- </w:t>
-      </w:r>
-      <w:r>
-        <w:br/>
-        <w:t xml:space="preserve">- </w:t>
+        <w:rPr>
+          <w:rFonts w:asciiTheme="majorHAnsi" w:hAnsiTheme="majorHAnsi" w:cstheme="majorHAnsi"/>
+        </w:rPr>
+        <w:t xml:space="preserve"> </w:t>
       </w:r>
     </w:p>
     <w:p>
@@ -2470,19 +3316,351 @@
           <w:ilvl w:val="0"/>
           <w:numId w:val="10"/>
         </w:numPr>
+        <w:jc w:val="both"/>
+        <w:rPr>
+          <w:rFonts w:cstheme="majorHAnsi"/>
+          <w:sz w:val="22"/>
+          <w:szCs w:val="22"/>
+        </w:rPr>
       </w:pPr>
       <w:bookmarkStart w:id="12" w:name="_Toc220513516"/>
       <w:r>
+        <w:rPr>
+          <w:rFonts w:cstheme="majorHAnsi"/>
+          <w:sz w:val="22"/>
+          <w:szCs w:val="22"/>
+        </w:rPr>
         <w:t>Non-Functional Requirements</w:t>
       </w:r>
       <w:bookmarkEnd w:id="12"/>
     </w:p>
     <w:p>
       <w:pPr>
-        <w:ind w:left="360"/>
+        <w:numPr>
+          <w:ilvl w:val="0"/>
+          <w:numId w:val="26"/>
+        </w:numPr>
+        <w:spacing w:before="100" w:beforeAutospacing="1" w:after="100" w:afterAutospacing="1" w:line="240" w:lineRule="auto"/>
+        <w:rPr>
+          <w:rFonts w:asciiTheme="majorHAnsi" w:eastAsia="Times New Roman" w:hAnsiTheme="majorHAnsi" w:cstheme="majorHAnsi"/>
+        </w:rPr>
       </w:pPr>
       <w:r>
-        <w:t>Specify system quality attributes such as performance, security, usability, reliability, etc.</w:t>
+        <w:rPr>
+          <w:rFonts w:asciiTheme="majorHAnsi" w:eastAsia="Times New Roman" w:hAnsiTheme="majorHAnsi" w:cstheme="majorHAnsi"/>
+          <w:b/>
+          <w:bCs/>
+        </w:rPr>
+        <w:t>Performance:</w:t>
+      </w:r>
+      <w:r>
+        <w:rPr>
+          <w:rFonts w:asciiTheme="majorHAnsi" w:eastAsia="Times New Roman" w:hAnsiTheme="majorHAnsi" w:cstheme="majorHAnsi"/>
+        </w:rPr>
+        <w:t xml:space="preserve"> </w:t>
+      </w:r>
+    </w:p>
+    <w:p>
+      <w:pPr>
+        <w:numPr>
+          <w:ilvl w:val="1"/>
+          <w:numId w:val="26"/>
+        </w:numPr>
+        <w:spacing w:before="100" w:beforeAutospacing="1" w:after="100" w:afterAutospacing="1" w:line="240" w:lineRule="auto"/>
+        <w:rPr>
+          <w:rFonts w:asciiTheme="majorHAnsi" w:eastAsia="Times New Roman" w:hAnsiTheme="majorHAnsi" w:cstheme="majorHAnsi"/>
+        </w:rPr>
+      </w:pPr>
+      <w:r>
+        <w:rPr>
+          <w:rFonts w:asciiTheme="majorHAnsi" w:eastAsia="Times New Roman" w:hAnsiTheme="majorHAnsi" w:cstheme="majorHAnsi"/>
+        </w:rPr>
+        <w:t xml:space="preserve">API response time ≤ 3 seconds </w:t>
+      </w:r>
+    </w:p>
+    <w:p>
+      <w:pPr>
+        <w:numPr>
+          <w:ilvl w:val="1"/>
+          <w:numId w:val="26"/>
+        </w:numPr>
+        <w:spacing w:before="100" w:beforeAutospacing="1" w:after="100" w:afterAutospacing="1" w:line="240" w:lineRule="auto"/>
+        <w:rPr>
+          <w:rFonts w:asciiTheme="majorHAnsi" w:eastAsia="Times New Roman" w:hAnsiTheme="majorHAnsi" w:cstheme="majorHAnsi"/>
+        </w:rPr>
+      </w:pPr>
+      <w:r>
+        <w:rPr>
+          <w:rFonts w:asciiTheme="majorHAnsi" w:eastAsia="Times New Roman" w:hAnsiTheme="majorHAnsi" w:cstheme="majorHAnsi"/>
+        </w:rPr>
+        <w:t xml:space="preserve">Supports at least 100 concurrent users </w:t>
+      </w:r>
+    </w:p>
+    <w:p>
+      <w:pPr>
+        <w:numPr>
+          <w:ilvl w:val="0"/>
+          <w:numId w:val="26"/>
+        </w:numPr>
+        <w:spacing w:before="100" w:beforeAutospacing="1" w:after="100" w:afterAutospacing="1" w:line="240" w:lineRule="auto"/>
+        <w:rPr>
+          <w:rFonts w:asciiTheme="majorHAnsi" w:eastAsia="Times New Roman" w:hAnsiTheme="majorHAnsi" w:cstheme="majorHAnsi"/>
+        </w:rPr>
+      </w:pPr>
+      <w:r>
+        <w:rPr>
+          <w:rFonts w:asciiTheme="majorHAnsi" w:eastAsia="Times New Roman" w:hAnsiTheme="majorHAnsi" w:cstheme="majorHAnsi"/>
+          <w:b/>
+          <w:bCs/>
+        </w:rPr>
+        <w:t>Security:</w:t>
+      </w:r>
+      <w:r>
+        <w:rPr>
+          <w:rFonts w:asciiTheme="majorHAnsi" w:eastAsia="Times New Roman" w:hAnsiTheme="majorHAnsi" w:cstheme="majorHAnsi"/>
+        </w:rPr>
+        <w:t xml:space="preserve"> </w:t>
+      </w:r>
+    </w:p>
+    <w:p>
+      <w:pPr>
+        <w:numPr>
+          <w:ilvl w:val="1"/>
+          <w:numId w:val="26"/>
+        </w:numPr>
+        <w:spacing w:before="100" w:beforeAutospacing="1" w:after="100" w:afterAutospacing="1" w:line="240" w:lineRule="auto"/>
+        <w:rPr>
+          <w:rFonts w:asciiTheme="majorHAnsi" w:eastAsia="Times New Roman" w:hAnsiTheme="majorHAnsi" w:cstheme="majorHAnsi"/>
+        </w:rPr>
+      </w:pPr>
+      <w:r>
+        <w:rPr>
+          <w:rFonts w:asciiTheme="majorHAnsi" w:eastAsia="Times New Roman" w:hAnsiTheme="majorHAnsi" w:cstheme="majorHAnsi"/>
+        </w:rPr>
+        <w:t xml:space="preserve">HTTPS encryption </w:t>
+      </w:r>
+    </w:p>
+    <w:p>
+      <w:pPr>
+        <w:numPr>
+          <w:ilvl w:val="1"/>
+          <w:numId w:val="26"/>
+        </w:numPr>
+        <w:spacing w:before="100" w:beforeAutospacing="1" w:after="100" w:afterAutospacing="1" w:line="240" w:lineRule="auto"/>
+        <w:rPr>
+          <w:rFonts w:asciiTheme="majorHAnsi" w:eastAsia="Times New Roman" w:hAnsiTheme="majorHAnsi" w:cstheme="majorHAnsi"/>
+        </w:rPr>
+      </w:pPr>
+      <w:r>
+        <w:rPr>
+          <w:rFonts w:asciiTheme="majorHAnsi" w:eastAsia="Times New Roman" w:hAnsiTheme="majorHAnsi" w:cstheme="majorHAnsi"/>
+        </w:rPr>
+        <w:t xml:space="preserve">JWT authentication </w:t>
+      </w:r>
+    </w:p>
+    <w:p>
+      <w:pPr>
+        <w:numPr>
+          <w:ilvl w:val="1"/>
+          <w:numId w:val="26"/>
+        </w:numPr>
+        <w:spacing w:before="100" w:beforeAutospacing="1" w:after="100" w:afterAutospacing="1" w:line="240" w:lineRule="auto"/>
+        <w:rPr>
+          <w:rFonts w:asciiTheme="majorHAnsi" w:eastAsia="Times New Roman" w:hAnsiTheme="majorHAnsi" w:cstheme="majorHAnsi"/>
+        </w:rPr>
+      </w:pPr>
+      <w:r>
+        <w:rPr>
+          <w:rFonts w:asciiTheme="majorHAnsi" w:eastAsia="Times New Roman" w:hAnsiTheme="majorHAnsi" w:cstheme="majorHAnsi"/>
+        </w:rPr>
+        <w:t xml:space="preserve">Password hashing using bcrypt </w:t>
+      </w:r>
+    </w:p>
+    <w:p>
+      <w:pPr>
+        <w:numPr>
+          <w:ilvl w:val="0"/>
+          <w:numId w:val="26"/>
+        </w:numPr>
+        <w:spacing w:before="100" w:beforeAutospacing="1" w:after="100" w:afterAutospacing="1" w:line="240" w:lineRule="auto"/>
+        <w:rPr>
+          <w:rFonts w:asciiTheme="majorHAnsi" w:eastAsia="Times New Roman" w:hAnsiTheme="majorHAnsi" w:cstheme="majorHAnsi"/>
+        </w:rPr>
+      </w:pPr>
+      <w:r>
+        <w:rPr>
+          <w:rFonts w:asciiTheme="majorHAnsi" w:eastAsia="Times New Roman" w:hAnsiTheme="majorHAnsi" w:cstheme="majorHAnsi"/>
+          <w:b/>
+          <w:bCs/>
+        </w:rPr>
+        <w:t>Usability:</w:t>
+      </w:r>
+      <w:r>
+        <w:rPr>
+          <w:rFonts w:asciiTheme="majorHAnsi" w:eastAsia="Times New Roman" w:hAnsiTheme="majorHAnsi" w:cstheme="majorHAnsi"/>
+        </w:rPr>
+        <w:t xml:space="preserve"> </w:t>
+      </w:r>
+    </w:p>
+    <w:p>
+      <w:pPr>
+        <w:numPr>
+          <w:ilvl w:val="1"/>
+          <w:numId w:val="26"/>
+        </w:numPr>
+        <w:spacing w:before="100" w:beforeAutospacing="1" w:after="100" w:afterAutospacing="1" w:line="240" w:lineRule="auto"/>
+        <w:rPr>
+          <w:rFonts w:asciiTheme="majorHAnsi" w:eastAsia="Times New Roman" w:hAnsiTheme="majorHAnsi" w:cstheme="majorHAnsi"/>
+        </w:rPr>
+      </w:pPr>
+      <w:r>
+        <w:rPr>
+          <w:rFonts w:asciiTheme="majorHAnsi" w:eastAsia="Times New Roman" w:hAnsiTheme="majorHAnsi" w:cstheme="majorHAnsi"/>
+        </w:rPr>
+        <w:t xml:space="preserve">Easy navigation across pages </w:t>
+      </w:r>
+    </w:p>
+    <w:p>
+      <w:pPr>
+        <w:numPr>
+          <w:ilvl w:val="1"/>
+          <w:numId w:val="26"/>
+        </w:numPr>
+        <w:spacing w:before="100" w:beforeAutospacing="1" w:after="100" w:afterAutospacing="1" w:line="240" w:lineRule="auto"/>
+        <w:rPr>
+          <w:rFonts w:asciiTheme="majorHAnsi" w:eastAsia="Times New Roman" w:hAnsiTheme="majorHAnsi" w:cstheme="majorHAnsi"/>
+        </w:rPr>
+      </w:pPr>
+      <w:r>
+        <w:rPr>
+          <w:rFonts w:asciiTheme="majorHAnsi" w:eastAsia="Times New Roman" w:hAnsiTheme="majorHAnsi" w:cstheme="majorHAnsi"/>
+        </w:rPr>
+        <w:lastRenderedPageBreak/>
+        <w:t xml:space="preserve">Responsive design for web and mobile </w:t>
+      </w:r>
+    </w:p>
+    <w:p>
+      <w:pPr>
+        <w:numPr>
+          <w:ilvl w:val="1"/>
+          <w:numId w:val="26"/>
+        </w:numPr>
+        <w:spacing w:before="100" w:beforeAutospacing="1" w:after="100" w:afterAutospacing="1" w:line="240" w:lineRule="auto"/>
+        <w:rPr>
+          <w:rFonts w:asciiTheme="majorHAnsi" w:eastAsia="Times New Roman" w:hAnsiTheme="majorHAnsi" w:cstheme="majorHAnsi"/>
+        </w:rPr>
+      </w:pPr>
+      <w:r>
+        <w:rPr>
+          <w:rFonts w:asciiTheme="majorHAnsi" w:eastAsia="Times New Roman" w:hAnsiTheme="majorHAnsi" w:cstheme="majorHAnsi"/>
+        </w:rPr>
+        <w:t xml:space="preserve">Clear error messages </w:t>
+      </w:r>
+    </w:p>
+    <w:p>
+      <w:pPr>
+        <w:numPr>
+          <w:ilvl w:val="0"/>
+          <w:numId w:val="26"/>
+        </w:numPr>
+        <w:spacing w:before="100" w:beforeAutospacing="1" w:after="100" w:afterAutospacing="1" w:line="240" w:lineRule="auto"/>
+        <w:rPr>
+          <w:rFonts w:asciiTheme="majorHAnsi" w:eastAsia="Times New Roman" w:hAnsiTheme="majorHAnsi" w:cstheme="majorHAnsi"/>
+        </w:rPr>
+      </w:pPr>
+      <w:r>
+        <w:rPr>
+          <w:rFonts w:asciiTheme="majorHAnsi" w:eastAsia="Times New Roman" w:hAnsiTheme="majorHAnsi" w:cstheme="majorHAnsi"/>
+          <w:b/>
+          <w:bCs/>
+        </w:rPr>
+        <w:t>Reliability:</w:t>
+      </w:r>
+      <w:r>
+        <w:rPr>
+          <w:rFonts w:asciiTheme="majorHAnsi" w:eastAsia="Times New Roman" w:hAnsiTheme="majorHAnsi" w:cstheme="majorHAnsi"/>
+        </w:rPr>
+        <w:t xml:space="preserve"> </w:t>
+      </w:r>
+    </w:p>
+    <w:p>
+      <w:pPr>
+        <w:numPr>
+          <w:ilvl w:val="1"/>
+          <w:numId w:val="26"/>
+        </w:numPr>
+        <w:spacing w:before="100" w:beforeAutospacing="1" w:after="100" w:afterAutospacing="1" w:line="240" w:lineRule="auto"/>
+        <w:rPr>
+          <w:rFonts w:asciiTheme="majorHAnsi" w:eastAsia="Times New Roman" w:hAnsiTheme="majorHAnsi" w:cstheme="majorHAnsi"/>
+        </w:rPr>
+      </w:pPr>
+      <w:r>
+        <w:rPr>
+          <w:rFonts w:asciiTheme="majorHAnsi" w:eastAsia="Times New Roman" w:hAnsiTheme="majorHAnsi" w:cstheme="majorHAnsi"/>
+        </w:rPr>
+        <w:t xml:space="preserve">System uptime should be high </w:t>
+      </w:r>
+    </w:p>
+    <w:p>
+      <w:pPr>
+        <w:numPr>
+          <w:ilvl w:val="1"/>
+          <w:numId w:val="26"/>
+        </w:numPr>
+        <w:spacing w:before="100" w:beforeAutospacing="1" w:after="100" w:afterAutospacing="1" w:line="240" w:lineRule="auto"/>
+        <w:rPr>
+          <w:rFonts w:asciiTheme="majorHAnsi" w:eastAsia="Times New Roman" w:hAnsiTheme="majorHAnsi" w:cstheme="majorHAnsi"/>
+        </w:rPr>
+      </w:pPr>
+      <w:r>
+        <w:rPr>
+          <w:rFonts w:asciiTheme="majorHAnsi" w:eastAsia="Times New Roman" w:hAnsiTheme="majorHAnsi" w:cstheme="majorHAnsi"/>
+        </w:rPr>
+        <w:t xml:space="preserve">Database consistency maintained </w:t>
+      </w:r>
+    </w:p>
+    <w:p>
+      <w:pPr>
+        <w:numPr>
+          <w:ilvl w:val="0"/>
+          <w:numId w:val="26"/>
+        </w:numPr>
+        <w:spacing w:before="100" w:beforeAutospacing="1" w:after="100" w:afterAutospacing="1" w:line="240" w:lineRule="auto"/>
+        <w:rPr>
+          <w:rFonts w:asciiTheme="majorHAnsi" w:eastAsia="Times New Roman" w:hAnsiTheme="majorHAnsi" w:cstheme="majorHAnsi"/>
+        </w:rPr>
+      </w:pPr>
+      <w:r>
+        <w:rPr>
+          <w:rFonts w:asciiTheme="majorHAnsi" w:eastAsia="Times New Roman" w:hAnsiTheme="majorHAnsi" w:cstheme="majorHAnsi"/>
+          <w:b/>
+          <w:bCs/>
+        </w:rPr>
+        <w:t>Compatibility:</w:t>
+      </w:r>
+      <w:r>
+        <w:rPr>
+          <w:rFonts w:asciiTheme="majorHAnsi" w:eastAsia="Times New Roman" w:hAnsiTheme="majorHAnsi" w:cstheme="majorHAnsi"/>
+        </w:rPr>
+        <w:t xml:space="preserve"> </w:t>
+      </w:r>
+    </w:p>
+    <w:p>
+      <w:pPr>
+        <w:numPr>
+          <w:ilvl w:val="1"/>
+          <w:numId w:val="26"/>
+        </w:numPr>
+        <w:spacing w:before="100" w:beforeAutospacing="1" w:after="100" w:afterAutospacing="1" w:line="240" w:lineRule="auto"/>
+        <w:rPr>
+          <w:rFonts w:asciiTheme="majorHAnsi" w:eastAsia="Times New Roman" w:hAnsiTheme="majorHAnsi" w:cstheme="majorHAnsi"/>
+        </w:rPr>
+      </w:pPr>
+      <w:r>
+        <w:rPr>
+          <w:rFonts w:asciiTheme="majorHAnsi" w:eastAsia="Times New Roman" w:hAnsiTheme="majorHAnsi" w:cstheme="majorHAnsi"/>
+        </w:rPr>
+        <w:t xml:space="preserve">Works across modern browsers and Android devices </w:t>
       </w:r>
     </w:p>
     <w:p>
@@ -2492,10 +3670,20 @@
           <w:ilvl w:val="0"/>
           <w:numId w:val="10"/>
         </w:numPr>
+        <w:jc w:val="both"/>
+        <w:rPr>
+          <w:rFonts w:cstheme="majorHAnsi"/>
+          <w:sz w:val="22"/>
+          <w:szCs w:val="22"/>
+        </w:rPr>
       </w:pPr>
       <w:bookmarkStart w:id="13" w:name="_Toc220513517"/>
       <w:r>
-        <w:lastRenderedPageBreak/>
+        <w:rPr>
+          <w:rFonts w:cstheme="majorHAnsi"/>
+          <w:sz w:val="22"/>
+          <w:szCs w:val="22"/>
+        </w:rPr>
         <w:t>System Models (Diagrams)</w:t>
       </w:r>
       <w:bookmarkEnd w:id="13"/>
@@ -2507,23 +3695,37 @@
           <w:ilvl w:val="1"/>
           <w:numId w:val="10"/>
         </w:numPr>
+        <w:jc w:val="both"/>
+        <w:rPr>
+          <w:rFonts w:cstheme="majorHAnsi"/>
+        </w:rPr>
       </w:pPr>
       <w:bookmarkStart w:id="14" w:name="_Toc220513518"/>
       <w:r>
+        <w:rPr>
+          <w:rFonts w:cstheme="majorHAnsi"/>
+        </w:rPr>
         <w:t>ERD</w:t>
       </w:r>
       <w:bookmarkEnd w:id="14"/>
     </w:p>
     <w:p>
+      <w:pPr>
+        <w:jc w:val="both"/>
+        <w:rPr>
+          <w:rFonts w:asciiTheme="majorHAnsi" w:hAnsiTheme="majorHAnsi" w:cstheme="majorHAnsi"/>
+        </w:rPr>
+      </w:pPr>
       <w:r>
         <w:rPr>
+          <w:rFonts w:asciiTheme="majorHAnsi" w:hAnsiTheme="majorHAnsi" w:cstheme="majorHAnsi"/>
           <w:noProof/>
         </w:rPr>
         <w:drawing>
-          <wp:inline distT="0" distB="0" distL="0" distR="0" wp14:anchorId="1B0AA61B" wp14:editId="54D12FCE">
-            <wp:extent cx="4397245" cy="3951515"/>
-            <wp:effectExtent l="0" t="0" r="0" b="0"/>
-            <wp:docPr id="3" name="Picture 3" descr="C:\Users\L24X09W13\AppData\Local\Microsoft\Windows\INetCache\Content.MSO\3F551052.tmp"/>
+          <wp:inline distT="0" distB="0" distL="0" distR="0" wp14:anchorId="3A398A90" wp14:editId="584D03CC">
+            <wp:extent cx="5486400" cy="3534410"/>
+            <wp:effectExtent l="0" t="0" r="0" b="8890"/>
+            <wp:docPr id="109391722" name="Picture 1" descr="C:\Users\L24X09W13\AppData\Local\Microsoft\Windows\INetCache\Content.MSO\4A975F0A.tmp"/>
             <wp:cNvGraphicFramePr>
               <a:graphicFrameLocks xmlns:a="http://schemas.openxmlformats.org/drawingml/2006/main" noChangeAspect="1"/>
             </wp:cNvGraphicFramePr>
@@ -2531,7 +3733,7 @@
               <a:graphicData uri="http://schemas.openxmlformats.org/drawingml/2006/picture">
                 <pic:pic xmlns:pic="http://schemas.openxmlformats.org/drawingml/2006/picture">
                   <pic:nvPicPr>
-                    <pic:cNvPr id="0" name="Picture 10" descr="C:\Users\L24X09W13\AppData\Local\Microsoft\Windows\INetCache\Content.MSO\3F551052.tmp"/>
+                    <pic:cNvPr id="0" name="Picture 3" descr="C:\Users\L24X09W13\AppData\Local\Microsoft\Windows\INetCache\Content.MSO\4A975F0A.tmp"/>
                     <pic:cNvPicPr>
                       <a:picLocks noChangeAspect="1" noChangeArrowheads="1"/>
                     </pic:cNvPicPr>
@@ -2552,7 +3754,7 @@
                   <pic:spPr bwMode="auto">
                     <a:xfrm>
                       <a:off x="0" y="0"/>
-                      <a:ext cx="4424219" cy="3975754"/>
+                      <a:ext cx="5486400" cy="3534410"/>
                     </a:xfrm>
                     <a:prstGeom prst="rect">
                       <a:avLst/>
@@ -2576,67 +3778,27 @@
           <w:ilvl w:val="1"/>
           <w:numId w:val="10"/>
         </w:numPr>
+        <w:jc w:val="both"/>
+        <w:rPr>
+          <w:rFonts w:cstheme="majorHAnsi"/>
+        </w:rPr>
       </w:pPr>
       <w:bookmarkStart w:id="15" w:name="_Toc220513519"/>
       <w:r>
+        <w:rPr>
+          <w:rFonts w:cstheme="majorHAnsi"/>
+        </w:rPr>
         <w:t>Use Case Diagram</w:t>
       </w:r>
       <w:bookmarkEnd w:id="15"/>
     </w:p>
     <w:p>
-      <w:r>
-        <w:rPr>
-          <w:noProof/>
-        </w:rPr>
-        <w:drawing>
-          <wp:inline distT="0" distB="0" distL="0" distR="0" wp14:anchorId="7D2B32A4" wp14:editId="63D428D3">
-            <wp:extent cx="4334494" cy="2368996"/>
-            <wp:effectExtent l="0" t="0" r="0" b="0"/>
-            <wp:docPr id="5" name="Picture 5" descr="C:\Users\L24X09W13\AppData\Local\Microsoft\Windows\INetCache\Content.MSO\4509BE.tmp"/>
-            <wp:cNvGraphicFramePr>
-              <a:graphicFrameLocks xmlns:a="http://schemas.openxmlformats.org/drawingml/2006/main" noChangeAspect="1"/>
-            </wp:cNvGraphicFramePr>
-            <a:graphic xmlns:a="http://schemas.openxmlformats.org/drawingml/2006/main">
-              <a:graphicData uri="http://schemas.openxmlformats.org/drawingml/2006/picture">
-                <pic:pic xmlns:pic="http://schemas.openxmlformats.org/drawingml/2006/picture">
-                  <pic:nvPicPr>
-                    <pic:cNvPr id="0" name="Picture 17" descr="C:\Users\L24X09W13\AppData\Local\Microsoft\Windows\INetCache\Content.MSO\4509BE.tmp"/>
-                    <pic:cNvPicPr>
-                      <a:picLocks noChangeAspect="1" noChangeArrowheads="1"/>
-                    </pic:cNvPicPr>
-                  </pic:nvPicPr>
-                  <pic:blipFill>
-                    <a:blip r:embed="rId8">
-                      <a:extLst>
-                        <a:ext uri="{28A0092B-C50C-407E-A947-70E740481C1C}">
-                          <a14:useLocalDpi xmlns:a14="http://schemas.microsoft.com/office/drawing/2010/main" val="0"/>
-                        </a:ext>
-                      </a:extLst>
-                    </a:blip>
-                    <a:srcRect/>
-                    <a:stretch>
-                      <a:fillRect/>
-                    </a:stretch>
-                  </pic:blipFill>
-                  <pic:spPr bwMode="auto">
-                    <a:xfrm>
-                      <a:off x="0" y="0"/>
-                      <a:ext cx="4342647" cy="2373452"/>
-                    </a:xfrm>
-                    <a:prstGeom prst="rect">
-                      <a:avLst/>
-                    </a:prstGeom>
-                    <a:noFill/>
-                    <a:ln>
-                      <a:noFill/>
-                    </a:ln>
-                  </pic:spPr>
-                </pic:pic>
-              </a:graphicData>
-            </a:graphic>
-          </wp:inline>
-        </w:drawing>
-      </w:r>
+      <w:pPr>
+        <w:jc w:val="both"/>
+        <w:rPr>
+          <w:rFonts w:asciiTheme="majorHAnsi" w:hAnsiTheme="majorHAnsi" w:cstheme="majorHAnsi"/>
+        </w:rPr>
+      </w:pPr>
     </w:p>
     <w:p>
       <w:pPr>
@@ -2645,68 +3807,27 @@
           <w:ilvl w:val="1"/>
           <w:numId w:val="10"/>
         </w:numPr>
+        <w:jc w:val="both"/>
+        <w:rPr>
+          <w:rFonts w:cstheme="majorHAnsi"/>
+        </w:rPr>
       </w:pPr>
       <w:bookmarkStart w:id="16" w:name="_Toc220513520"/>
       <w:r>
-        <w:lastRenderedPageBreak/>
+        <w:rPr>
+          <w:rFonts w:cstheme="majorHAnsi"/>
+        </w:rPr>
         <w:t>Activity Diagram</w:t>
       </w:r>
       <w:bookmarkEnd w:id="16"/>
     </w:p>
     <w:p>
-      <w:r>
-        <w:rPr>
-          <w:noProof/>
-        </w:rPr>
-        <w:drawing>
-          <wp:inline distT="0" distB="0" distL="0" distR="0" wp14:anchorId="46340709" wp14:editId="0BE5F2A6">
-            <wp:extent cx="3230088" cy="4277711"/>
-            <wp:effectExtent l="0" t="0" r="8890" b="8890"/>
-            <wp:docPr id="10" name="Picture 10" descr="C:\Users\L24X09W13\AppData\Local\Microsoft\Windows\INetCache\Content.MSO\87315554.tmp"/>
-            <wp:cNvGraphicFramePr>
-              <a:graphicFrameLocks xmlns:a="http://schemas.openxmlformats.org/drawingml/2006/main" noChangeAspect="1"/>
-            </wp:cNvGraphicFramePr>
-            <a:graphic xmlns:a="http://schemas.openxmlformats.org/drawingml/2006/main">
-              <a:graphicData uri="http://schemas.openxmlformats.org/drawingml/2006/picture">
-                <pic:pic xmlns:pic="http://schemas.openxmlformats.org/drawingml/2006/picture">
-                  <pic:nvPicPr>
-                    <pic:cNvPr id="0" name="Picture 33" descr="C:\Users\L24X09W13\AppData\Local\Microsoft\Windows\INetCache\Content.MSO\87315554.tmp"/>
-                    <pic:cNvPicPr>
-                      <a:picLocks noChangeAspect="1" noChangeArrowheads="1"/>
-                    </pic:cNvPicPr>
-                  </pic:nvPicPr>
-                  <pic:blipFill>
-                    <a:blip r:embed="rId9">
-                      <a:extLst>
-                        <a:ext uri="{28A0092B-C50C-407E-A947-70E740481C1C}">
-                          <a14:useLocalDpi xmlns:a14="http://schemas.microsoft.com/office/drawing/2010/main" val="0"/>
-                        </a:ext>
-                      </a:extLst>
-                    </a:blip>
-                    <a:srcRect/>
-                    <a:stretch>
-                      <a:fillRect/>
-                    </a:stretch>
-                  </pic:blipFill>
-                  <pic:spPr bwMode="auto">
-                    <a:xfrm>
-                      <a:off x="0" y="0"/>
-                      <a:ext cx="3236466" cy="4286158"/>
-                    </a:xfrm>
-                    <a:prstGeom prst="rect">
-                      <a:avLst/>
-                    </a:prstGeom>
-                    <a:noFill/>
-                    <a:ln>
-                      <a:noFill/>
-                    </a:ln>
-                  </pic:spPr>
-                </pic:pic>
-              </a:graphicData>
-            </a:graphic>
-          </wp:inline>
-        </w:drawing>
-      </w:r>
+      <w:pPr>
+        <w:jc w:val="both"/>
+        <w:rPr>
+          <w:rFonts w:asciiTheme="majorHAnsi" w:hAnsiTheme="majorHAnsi" w:cstheme="majorHAnsi"/>
+        </w:rPr>
+      </w:pPr>
     </w:p>
     <w:p>
       <w:pPr>
@@ -2715,9 +3836,16 @@
           <w:ilvl w:val="1"/>
           <w:numId w:val="10"/>
         </w:numPr>
+        <w:jc w:val="both"/>
+        <w:rPr>
+          <w:rFonts w:cstheme="majorHAnsi"/>
+        </w:rPr>
       </w:pPr>
       <w:bookmarkStart w:id="17" w:name="_Toc220513521"/>
       <w:r>
+        <w:rPr>
+          <w:rFonts w:cstheme="majorHAnsi"/>
+        </w:rPr>
         <w:t>Class Diagram</w:t>
       </w:r>
       <w:bookmarkEnd w:id="17"/>
@@ -2725,66 +3853,12 @@
     <w:p>
       <w:pPr>
         <w:spacing w:after="0" w:line="240" w:lineRule="auto"/>
-        <w:rPr>
-          <w:rFonts w:ascii="Times New Roman" w:eastAsia="Times New Roman" w:hAnsi="Times New Roman" w:cs="Times New Roman"/>
-          <w:sz w:val="24"/>
-          <w:szCs w:val="24"/>
+        <w:jc w:val="both"/>
+        <w:rPr>
+          <w:rFonts w:asciiTheme="majorHAnsi" w:eastAsia="Times New Roman" w:hAnsiTheme="majorHAnsi" w:cstheme="majorHAnsi"/>
         </w:rPr>
       </w:pPr>
       <w:bookmarkStart w:id="18" w:name="_Toc220513522"/>
-      <w:r>
-        <w:rPr>
-          <w:noProof/>
-        </w:rPr>
-        <w:drawing>
-          <wp:inline distT="0" distB="0" distL="0" distR="0" wp14:anchorId="3EE7E4EF" wp14:editId="0AECA0FA">
-            <wp:extent cx="5301148" cy="2659380"/>
-            <wp:effectExtent l="0" t="0" r="0" b="0"/>
-            <wp:docPr id="166993405" name="Picture 4"/>
-            <wp:cNvGraphicFramePr>
-              <a:graphicFrameLocks xmlns:a="http://schemas.openxmlformats.org/drawingml/2006/main" noChangeAspect="1"/>
-            </wp:cNvGraphicFramePr>
-            <a:graphic xmlns:a="http://schemas.openxmlformats.org/drawingml/2006/main">
-              <a:graphicData uri="http://schemas.openxmlformats.org/drawingml/2006/picture">
-                <pic:pic xmlns:pic="http://schemas.openxmlformats.org/drawingml/2006/picture">
-                  <pic:nvPicPr>
-                    <pic:cNvPr id="0" name="Picture 9"/>
-                    <pic:cNvPicPr>
-                      <a:picLocks noChangeAspect="1" noChangeArrowheads="1"/>
-                    </pic:cNvPicPr>
-                  </pic:nvPicPr>
-                  <pic:blipFill>
-                    <a:blip r:embed="rId10">
-                      <a:extLst>
-                        <a:ext uri="{28A0092B-C50C-407E-A947-70E740481C1C}">
-                          <a14:useLocalDpi xmlns:a14="http://schemas.microsoft.com/office/drawing/2010/main" val="0"/>
-                        </a:ext>
-                      </a:extLst>
-                    </a:blip>
-                    <a:srcRect/>
-                    <a:stretch>
-                      <a:fillRect/>
-                    </a:stretch>
-                  </pic:blipFill>
-                  <pic:spPr bwMode="auto">
-                    <a:xfrm>
-                      <a:off x="0" y="0"/>
-                      <a:ext cx="5305087" cy="2661356"/>
-                    </a:xfrm>
-                    <a:prstGeom prst="rect">
-                      <a:avLst/>
-                    </a:prstGeom>
-                    <a:noFill/>
-                    <a:ln>
-                      <a:noFill/>
-                    </a:ln>
-                  </pic:spPr>
-                </pic:pic>
-              </a:graphicData>
-            </a:graphic>
-          </wp:inline>
-        </w:drawing>
-      </w:r>
     </w:p>
     <w:p>
       <w:pPr>
@@ -2793,9 +3867,15 @@
           <w:ilvl w:val="1"/>
           <w:numId w:val="10"/>
         </w:numPr>
+        <w:jc w:val="both"/>
+        <w:rPr>
+          <w:rFonts w:cstheme="majorHAnsi"/>
+        </w:rPr>
       </w:pPr>
       <w:r>
-        <w:lastRenderedPageBreak/>
+        <w:rPr>
+          <w:rFonts w:cstheme="majorHAnsi"/>
+        </w:rPr>
         <w:t>Sequence Diagram</w:t>
       </w:r>
       <w:bookmarkEnd w:id="18"/>
@@ -2803,84 +3883,28 @@
     <w:p>
       <w:pPr>
         <w:spacing w:after="0" w:line="240" w:lineRule="auto"/>
-        <w:rPr>
-          <w:rFonts w:ascii="Times New Roman" w:eastAsia="Times New Roman" w:hAnsi="Times New Roman" w:cs="Times New Roman"/>
-          <w:sz w:val="24"/>
-          <w:szCs w:val="24"/>
+        <w:jc w:val="both"/>
+        <w:rPr>
+          <w:rFonts w:asciiTheme="majorHAnsi" w:eastAsia="Times New Roman" w:hAnsiTheme="majorHAnsi" w:cstheme="majorHAnsi"/>
         </w:rPr>
       </w:pPr>
       <w:bookmarkStart w:id="19" w:name="_Toc220513523"/>
-      <w:r>
-        <w:rPr>
-          <w:noProof/>
-        </w:rPr>
-        <w:drawing>
-          <wp:inline distT="0" distB="0" distL="0" distR="0" wp14:anchorId="1B93341D" wp14:editId="239FB9E9">
-            <wp:extent cx="5044440" cy="5151768"/>
-            <wp:effectExtent l="0" t="0" r="3810" b="0"/>
-            <wp:docPr id="1244855962" name="Picture 3"/>
-            <wp:cNvGraphicFramePr>
-              <a:graphicFrameLocks xmlns:a="http://schemas.openxmlformats.org/drawingml/2006/main" noChangeAspect="1"/>
-            </wp:cNvGraphicFramePr>
-            <a:graphic xmlns:a="http://schemas.openxmlformats.org/drawingml/2006/main">
-              <a:graphicData uri="http://schemas.openxmlformats.org/drawingml/2006/picture">
-                <pic:pic xmlns:pic="http://schemas.openxmlformats.org/drawingml/2006/picture">
-                  <pic:nvPicPr>
-                    <pic:cNvPr id="0" name="Picture 7"/>
-                    <pic:cNvPicPr>
-                      <a:picLocks noChangeAspect="1" noChangeArrowheads="1"/>
-                    </pic:cNvPicPr>
-                  </pic:nvPicPr>
-                  <pic:blipFill>
-                    <a:blip r:embed="rId11">
-                      <a:extLst>
-                        <a:ext uri="{28A0092B-C50C-407E-A947-70E740481C1C}">
-                          <a14:useLocalDpi xmlns:a14="http://schemas.microsoft.com/office/drawing/2010/main" val="0"/>
-                        </a:ext>
-                      </a:extLst>
-                    </a:blip>
-                    <a:srcRect/>
-                    <a:stretch>
-                      <a:fillRect/>
-                    </a:stretch>
-                  </pic:blipFill>
-                  <pic:spPr bwMode="auto">
-                    <a:xfrm>
-                      <a:off x="0" y="0"/>
-                      <a:ext cx="5051273" cy="5158746"/>
-                    </a:xfrm>
-                    <a:prstGeom prst="rect">
-                      <a:avLst/>
-                    </a:prstGeom>
-                    <a:noFill/>
-                    <a:ln>
-                      <a:noFill/>
-                    </a:ln>
-                  </pic:spPr>
-                </pic:pic>
-              </a:graphicData>
-            </a:graphic>
-          </wp:inline>
-        </w:drawing>
-      </w:r>
     </w:p>
     <w:p>
       <w:pPr>
         <w:spacing w:after="0" w:line="240" w:lineRule="auto"/>
-        <w:rPr>
-          <w:rFonts w:ascii="Times New Roman" w:eastAsia="Times New Roman" w:hAnsi="Times New Roman" w:cs="Times New Roman"/>
-          <w:sz w:val="24"/>
-          <w:szCs w:val="24"/>
+        <w:jc w:val="both"/>
+        <w:rPr>
+          <w:rFonts w:asciiTheme="majorHAnsi" w:eastAsia="Times New Roman" w:hAnsiTheme="majorHAnsi" w:cstheme="majorHAnsi"/>
         </w:rPr>
       </w:pPr>
     </w:p>
     <w:p>
       <w:pPr>
         <w:spacing w:after="0" w:line="240" w:lineRule="auto"/>
-        <w:rPr>
-          <w:rFonts w:ascii="Times New Roman" w:eastAsia="Times New Roman" w:hAnsi="Times New Roman" w:cs="Times New Roman"/>
-          <w:sz w:val="24"/>
-          <w:szCs w:val="24"/>
+        <w:jc w:val="both"/>
+        <w:rPr>
+          <w:rFonts w:asciiTheme="majorHAnsi" w:eastAsia="Times New Roman" w:hAnsiTheme="majorHAnsi" w:cstheme="majorHAnsi"/>
         </w:rPr>
       </w:pPr>
     </w:p>
@@ -2891,7 +3915,24 @@
           <w:ilvl w:val="0"/>
           <w:numId w:val="10"/>
         </w:numPr>
-      </w:pPr>
+        <w:jc w:val="both"/>
+        <w:rPr>
+          <w:rFonts w:cstheme="majorHAnsi"/>
+          <w:sz w:val="22"/>
+          <w:szCs w:val="22"/>
+        </w:rPr>
+      </w:pPr>
+      <w:r>
+        <w:rPr>
+          <w:rFonts w:cstheme="majorHAnsi"/>
+          <w:sz w:val="22"/>
+          <w:szCs w:val="22"/>
+        </w:rPr>
+        <w:lastRenderedPageBreak/>
+        <w:t>Appendices</w:t>
+      </w:r>
+    </w:p>
+    <w:p>
       <w:r>
         <w:t>WEB UI</w:t>
       </w:r>
@@ -2904,17 +3945,14 @@
           <w:numId w:val="12"/>
         </w:numPr>
         <w:spacing w:after="0" w:line="240" w:lineRule="auto"/>
-        <w:rPr>
-          <w:rFonts w:ascii="Times New Roman" w:eastAsia="Times New Roman" w:hAnsi="Times New Roman" w:cs="Times New Roman"/>
-          <w:sz w:val="24"/>
-          <w:szCs w:val="24"/>
+        <w:jc w:val="both"/>
+        <w:rPr>
+          <w:rFonts w:asciiTheme="majorHAnsi" w:eastAsia="Times New Roman" w:hAnsiTheme="majorHAnsi" w:cstheme="majorHAnsi"/>
         </w:rPr>
       </w:pPr>
       <w:r>
         <w:rPr>
-          <w:rFonts w:ascii="Times New Roman" w:eastAsia="Times New Roman" w:hAnsi="Times New Roman" w:cs="Times New Roman"/>
-          <w:sz w:val="24"/>
-          <w:szCs w:val="24"/>
+          <w:rFonts w:asciiTheme="majorHAnsi" w:eastAsia="Times New Roman" w:hAnsiTheme="majorHAnsi" w:cstheme="majorHAnsi"/>
         </w:rPr>
         <w:t>Register/Signup</w:t>
       </w:r>
@@ -2923,19 +3961,16 @@
       <w:pPr>
         <w:pStyle w:val="ListParagraph"/>
         <w:spacing w:after="0" w:line="240" w:lineRule="auto"/>
-        <w:rPr>
-          <w:rFonts w:ascii="Times New Roman" w:eastAsia="Times New Roman" w:hAnsi="Times New Roman" w:cs="Times New Roman"/>
-          <w:sz w:val="24"/>
-          <w:szCs w:val="24"/>
+        <w:jc w:val="both"/>
+        <w:rPr>
+          <w:rFonts w:asciiTheme="majorHAnsi" w:eastAsia="Times New Roman" w:hAnsiTheme="majorHAnsi" w:cstheme="majorHAnsi"/>
         </w:rPr>
       </w:pPr>
       <w:r>
         <w:rPr>
-          <w:rFonts w:ascii="Times New Roman" w:eastAsia="Times New Roman" w:hAnsi="Times New Roman" w:cs="Times New Roman"/>
-          <w:sz w:val="24"/>
-          <w:szCs w:val="24"/>
-        </w:rPr>
-        <w:lastRenderedPageBreak/>
+          <w:rFonts w:asciiTheme="majorHAnsi" w:eastAsia="Times New Roman" w:hAnsiTheme="majorHAnsi" w:cstheme="majorHAnsi"/>
+          <w:noProof/>
+        </w:rPr>
         <w:drawing>
           <wp:inline distT="0" distB="0" distL="0" distR="0" wp14:anchorId="3DACC897" wp14:editId="2E7EFD84">
             <wp:extent cx="4480560" cy="4273646"/>
@@ -2952,7 +3987,7 @@
                     <pic:cNvPicPr/>
                   </pic:nvPicPr>
                   <pic:blipFill>
-                    <a:blip r:embed="rId12"/>
+                    <a:blip r:embed="rId8"/>
                     <a:stretch>
                       <a:fillRect/>
                     </a:stretch>
@@ -2981,46 +4016,32 @@
           <w:numId w:val="12"/>
         </w:numPr>
         <w:spacing w:after="0" w:line="240" w:lineRule="auto"/>
-        <w:rPr>
-          <w:rFonts w:ascii="Times New Roman" w:eastAsia="Times New Roman" w:hAnsi="Times New Roman" w:cs="Times New Roman"/>
-          <w:sz w:val="24"/>
-          <w:szCs w:val="24"/>
+        <w:jc w:val="both"/>
+        <w:rPr>
+          <w:rFonts w:asciiTheme="majorHAnsi" w:eastAsia="Times New Roman" w:hAnsiTheme="majorHAnsi" w:cstheme="majorHAnsi"/>
         </w:rPr>
       </w:pPr>
       <w:r>
         <w:rPr>
-          <w:rFonts w:ascii="Times New Roman" w:eastAsia="Times New Roman" w:hAnsi="Times New Roman" w:cs="Times New Roman"/>
-          <w:sz w:val="24"/>
-          <w:szCs w:val="24"/>
-        </w:rPr>
-        <w:t>Login/</w:t>
+          <w:rFonts w:asciiTheme="majorHAnsi" w:eastAsia="Times New Roman" w:hAnsiTheme="majorHAnsi" w:cstheme="majorHAnsi"/>
+        </w:rPr>
+        <w:t>Login/Signin</w:t>
       </w:r>
-      <w:proofErr w:type="spellStart"/>
-      <w:r>
-        <w:rPr>
-          <w:rFonts w:ascii="Times New Roman" w:eastAsia="Times New Roman" w:hAnsi="Times New Roman" w:cs="Times New Roman"/>
-          <w:sz w:val="24"/>
-          <w:szCs w:val="24"/>
-        </w:rPr>
-        <w:t>Signin</w:t>
-      </w:r>
-      <w:proofErr w:type="spellEnd"/>
     </w:p>
     <w:p>
       <w:pPr>
         <w:pStyle w:val="ListParagraph"/>
-        <w:rPr>
-          <w:rFonts w:ascii="Times New Roman" w:eastAsia="Times New Roman" w:hAnsi="Times New Roman" w:cs="Times New Roman"/>
-          <w:sz w:val="24"/>
-          <w:szCs w:val="24"/>
+        <w:jc w:val="both"/>
+        <w:rPr>
+          <w:rFonts w:asciiTheme="majorHAnsi" w:eastAsia="Times New Roman" w:hAnsiTheme="majorHAnsi" w:cstheme="majorHAnsi"/>
         </w:rPr>
       </w:pPr>
       <w:r>
         <w:rPr>
-          <w:rFonts w:ascii="Times New Roman" w:eastAsia="Times New Roman" w:hAnsi="Times New Roman" w:cs="Times New Roman"/>
-          <w:sz w:val="24"/>
-          <w:szCs w:val="24"/>
-        </w:rPr>
+          <w:rFonts w:asciiTheme="majorHAnsi" w:eastAsia="Times New Roman" w:hAnsiTheme="majorHAnsi" w:cstheme="majorHAnsi"/>
+          <w:noProof/>
+        </w:rPr>
+        <w:lastRenderedPageBreak/>
         <w:drawing>
           <wp:inline distT="0" distB="0" distL="0" distR="0" wp14:anchorId="292EEA1E" wp14:editId="07D848C2">
             <wp:extent cx="4658375" cy="3543795"/>
@@ -3037,7 +4058,7 @@
                     <pic:cNvPicPr/>
                   </pic:nvPicPr>
                   <pic:blipFill>
-                    <a:blip r:embed="rId13"/>
+                    <a:blip r:embed="rId9"/>
                     <a:stretch>
                       <a:fillRect/>
                     </a:stretch>
@@ -3061,10 +4082,9 @@
     <w:p>
       <w:pPr>
         <w:spacing w:after="0" w:line="240" w:lineRule="auto"/>
-        <w:rPr>
-          <w:rFonts w:ascii="Times New Roman" w:eastAsia="Times New Roman" w:hAnsi="Times New Roman" w:cs="Times New Roman"/>
-          <w:sz w:val="24"/>
-          <w:szCs w:val="24"/>
+        <w:jc w:val="both"/>
+        <w:rPr>
+          <w:rFonts w:asciiTheme="majorHAnsi" w:eastAsia="Times New Roman" w:hAnsiTheme="majorHAnsi" w:cstheme="majorHAnsi"/>
         </w:rPr>
       </w:pPr>
     </w:p>
@@ -3076,17 +4096,14 @@
           <w:numId w:val="12"/>
         </w:numPr>
         <w:spacing w:after="0" w:line="240" w:lineRule="auto"/>
-        <w:rPr>
-          <w:rFonts w:ascii="Times New Roman" w:eastAsia="Times New Roman" w:hAnsi="Times New Roman" w:cs="Times New Roman"/>
-          <w:sz w:val="24"/>
-          <w:szCs w:val="24"/>
+        <w:jc w:val="both"/>
+        <w:rPr>
+          <w:rFonts w:asciiTheme="majorHAnsi" w:eastAsia="Times New Roman" w:hAnsiTheme="majorHAnsi" w:cstheme="majorHAnsi"/>
         </w:rPr>
       </w:pPr>
       <w:r>
         <w:rPr>
-          <w:rFonts w:ascii="Times New Roman" w:eastAsia="Times New Roman" w:hAnsi="Times New Roman" w:cs="Times New Roman"/>
-          <w:sz w:val="24"/>
-          <w:szCs w:val="24"/>
+          <w:rFonts w:asciiTheme="majorHAnsi" w:eastAsia="Times New Roman" w:hAnsiTheme="majorHAnsi" w:cstheme="majorHAnsi"/>
         </w:rPr>
         <w:t>Profile</w:t>
       </w:r>
@@ -3094,14 +4111,14 @@
     <w:p>
       <w:pPr>
         <w:pStyle w:val="ListParagraph"/>
-        <w:rPr>
-          <w:rFonts w:ascii="Times New Roman" w:eastAsia="Times New Roman" w:hAnsi="Times New Roman" w:cs="Times New Roman"/>
-          <w:sz w:val="24"/>
-          <w:szCs w:val="24"/>
+        <w:jc w:val="both"/>
+        <w:rPr>
+          <w:rFonts w:asciiTheme="majorHAnsi" w:eastAsia="Times New Roman" w:hAnsiTheme="majorHAnsi" w:cstheme="majorHAnsi"/>
         </w:rPr>
       </w:pPr>
       <w:r>
         <w:rPr>
+          <w:rFonts w:asciiTheme="majorHAnsi" w:hAnsiTheme="majorHAnsi" w:cstheme="majorHAnsi"/>
           <w:noProof/>
         </w:rPr>
         <w:drawing>
@@ -3122,7 +4139,7 @@
                     </pic:cNvPicPr>
                   </pic:nvPicPr>
                   <pic:blipFill>
-                    <a:blip r:embed="rId14">
+                    <a:blip r:embed="rId10">
                       <a:extLst>
                         <a:ext uri="{28A0092B-C50C-407E-A947-70E740481C1C}">
                           <a14:useLocalDpi xmlns:a14="http://schemas.microsoft.com/office/drawing/2010/main" val="0"/>
@@ -3158,10 +4175,9 @@
       <w:pPr>
         <w:pStyle w:val="ListParagraph"/>
         <w:spacing w:after="0" w:line="240" w:lineRule="auto"/>
-        <w:rPr>
-          <w:rFonts w:ascii="Times New Roman" w:eastAsia="Times New Roman" w:hAnsi="Times New Roman" w:cs="Times New Roman"/>
-          <w:sz w:val="24"/>
-          <w:szCs w:val="24"/>
+        <w:jc w:val="both"/>
+        <w:rPr>
+          <w:rFonts w:asciiTheme="majorHAnsi" w:eastAsia="Times New Roman" w:hAnsiTheme="majorHAnsi" w:cstheme="majorHAnsi"/>
         </w:rPr>
       </w:pPr>
     </w:p>
@@ -3173,17 +4189,14 @@
           <w:numId w:val="12"/>
         </w:numPr>
         <w:spacing w:after="0" w:line="240" w:lineRule="auto"/>
-        <w:rPr>
-          <w:rFonts w:ascii="Times New Roman" w:eastAsia="Times New Roman" w:hAnsi="Times New Roman" w:cs="Times New Roman"/>
-          <w:sz w:val="24"/>
-          <w:szCs w:val="24"/>
+        <w:jc w:val="both"/>
+        <w:rPr>
+          <w:rFonts w:asciiTheme="majorHAnsi" w:eastAsia="Times New Roman" w:hAnsiTheme="majorHAnsi" w:cstheme="majorHAnsi"/>
         </w:rPr>
       </w:pPr>
       <w:r>
         <w:rPr>
-          <w:rFonts w:ascii="Times New Roman" w:eastAsia="Times New Roman" w:hAnsi="Times New Roman" w:cs="Times New Roman"/>
-          <w:sz w:val="24"/>
-          <w:szCs w:val="24"/>
+          <w:rFonts w:asciiTheme="majorHAnsi" w:eastAsia="Times New Roman" w:hAnsiTheme="majorHAnsi" w:cstheme="majorHAnsi"/>
         </w:rPr>
         <w:t>Logout</w:t>
       </w:r>
@@ -3192,18 +4205,17 @@
       <w:pPr>
         <w:spacing w:after="0" w:line="240" w:lineRule="auto"/>
         <w:ind w:left="360"/>
-        <w:rPr>
-          <w:rFonts w:ascii="Times New Roman" w:eastAsia="Times New Roman" w:hAnsi="Times New Roman" w:cs="Times New Roman"/>
-          <w:sz w:val="24"/>
-          <w:szCs w:val="24"/>
+        <w:jc w:val="both"/>
+        <w:rPr>
+          <w:rFonts w:asciiTheme="majorHAnsi" w:eastAsia="Times New Roman" w:hAnsiTheme="majorHAnsi" w:cstheme="majorHAnsi"/>
         </w:rPr>
       </w:pPr>
       <w:r>
         <w:rPr>
-          <w:rFonts w:ascii="Times New Roman" w:eastAsia="Times New Roman" w:hAnsi="Times New Roman" w:cs="Times New Roman"/>
-          <w:sz w:val="24"/>
-          <w:szCs w:val="24"/>
-        </w:rPr>
+          <w:rFonts w:asciiTheme="majorHAnsi" w:eastAsia="Times New Roman" w:hAnsiTheme="majorHAnsi" w:cstheme="majorHAnsi"/>
+          <w:noProof/>
+        </w:rPr>
+        <w:lastRenderedPageBreak/>
         <w:drawing>
           <wp:inline distT="0" distB="0" distL="0" distR="0" wp14:anchorId="0AF3FFA4" wp14:editId="1D73D520">
             <wp:extent cx="5032795" cy="2308860"/>
@@ -3220,7 +4232,7 @@
                     <pic:cNvPicPr/>
                   </pic:nvPicPr>
                   <pic:blipFill>
-                    <a:blip r:embed="rId15"/>
+                    <a:blip r:embed="rId11"/>
                     <a:stretch>
                       <a:fillRect/>
                     </a:stretch>
@@ -3241,22 +4253,14 @@
         </w:drawing>
       </w:r>
     </w:p>
+    <w:bookmarkEnd w:id="19"/>
     <w:p>
       <w:pPr>
-        <w:pStyle w:val="Heading2"/>
-        <w:numPr>
-          <w:ilvl w:val="0"/>
-          <w:numId w:val="10"/>
-        </w:numPr>
-      </w:pPr>
-      <w:r>
-        <w:t>Appendices</w:t>
-      </w:r>
-      <w:bookmarkEnd w:id="19"/>
-    </w:p>
-    <w:p>
-      <w:pPr>
         <w:ind w:left="360"/>
+        <w:jc w:val="both"/>
+        <w:rPr>
+          <w:rFonts w:asciiTheme="majorHAnsi" w:hAnsiTheme="majorHAnsi" w:cstheme="majorHAnsi"/>
+        </w:rPr>
       </w:pPr>
     </w:p>
     <w:sectPr>
@@ -3564,6 +4568,913 @@
     </w:lvl>
   </w:abstractNum>
   <w:abstractNum w:abstractNumId="10" w15:restartNumberingAfterBreak="0">
+    <w:nsid w:val="01A13BF5"/>
+    <w:multiLevelType w:val="hybridMultilevel"/>
+    <w:tmpl w:val="BC8A95CA"/>
+    <w:lvl w:ilvl="0" w:tplc="04090001">
+      <w:start w:val="1"/>
+      <w:numFmt w:val="bullet"/>
+      <w:lvlText w:val=""/>
+      <w:lvlJc w:val="left"/>
+      <w:pPr>
+        <w:ind w:left="1080" w:hanging="360"/>
+      </w:pPr>
+      <w:rPr>
+        <w:rFonts w:ascii="Symbol" w:hAnsi="Symbol" w:hint="default"/>
+      </w:rPr>
+    </w:lvl>
+    <w:lvl w:ilvl="1" w:tplc="04090003" w:tentative="1">
+      <w:start w:val="1"/>
+      <w:numFmt w:val="bullet"/>
+      <w:lvlText w:val="o"/>
+      <w:lvlJc w:val="left"/>
+      <w:pPr>
+        <w:ind w:left="1800" w:hanging="360"/>
+      </w:pPr>
+      <w:rPr>
+        <w:rFonts w:ascii="Courier New" w:hAnsi="Courier New" w:cs="Courier New" w:hint="default"/>
+      </w:rPr>
+    </w:lvl>
+    <w:lvl w:ilvl="2" w:tplc="04090005" w:tentative="1">
+      <w:start w:val="1"/>
+      <w:numFmt w:val="bullet"/>
+      <w:lvlText w:val=""/>
+      <w:lvlJc w:val="left"/>
+      <w:pPr>
+        <w:ind w:left="2520" w:hanging="360"/>
+      </w:pPr>
+      <w:rPr>
+        <w:rFonts w:ascii="Wingdings" w:hAnsi="Wingdings" w:hint="default"/>
+      </w:rPr>
+    </w:lvl>
+    <w:lvl w:ilvl="3" w:tplc="04090001" w:tentative="1">
+      <w:start w:val="1"/>
+      <w:numFmt w:val="bullet"/>
+      <w:lvlText w:val=""/>
+      <w:lvlJc w:val="left"/>
+      <w:pPr>
+        <w:ind w:left="3240" w:hanging="360"/>
+      </w:pPr>
+      <w:rPr>
+        <w:rFonts w:ascii="Symbol" w:hAnsi="Symbol" w:hint="default"/>
+      </w:rPr>
+    </w:lvl>
+    <w:lvl w:ilvl="4" w:tplc="04090003" w:tentative="1">
+      <w:start w:val="1"/>
+      <w:numFmt w:val="bullet"/>
+      <w:lvlText w:val="o"/>
+      <w:lvlJc w:val="left"/>
+      <w:pPr>
+        <w:ind w:left="3960" w:hanging="360"/>
+      </w:pPr>
+      <w:rPr>
+        <w:rFonts w:ascii="Courier New" w:hAnsi="Courier New" w:cs="Courier New" w:hint="default"/>
+      </w:rPr>
+    </w:lvl>
+    <w:lvl w:ilvl="5" w:tplc="04090005" w:tentative="1">
+      <w:start w:val="1"/>
+      <w:numFmt w:val="bullet"/>
+      <w:lvlText w:val=""/>
+      <w:lvlJc w:val="left"/>
+      <w:pPr>
+        <w:ind w:left="4680" w:hanging="360"/>
+      </w:pPr>
+      <w:rPr>
+        <w:rFonts w:ascii="Wingdings" w:hAnsi="Wingdings" w:hint="default"/>
+      </w:rPr>
+    </w:lvl>
+    <w:lvl w:ilvl="6" w:tplc="04090001" w:tentative="1">
+      <w:start w:val="1"/>
+      <w:numFmt w:val="bullet"/>
+      <w:lvlText w:val=""/>
+      <w:lvlJc w:val="left"/>
+      <w:pPr>
+        <w:ind w:left="5400" w:hanging="360"/>
+      </w:pPr>
+      <w:rPr>
+        <w:rFonts w:ascii="Symbol" w:hAnsi="Symbol" w:hint="default"/>
+      </w:rPr>
+    </w:lvl>
+    <w:lvl w:ilvl="7" w:tplc="04090003" w:tentative="1">
+      <w:start w:val="1"/>
+      <w:numFmt w:val="bullet"/>
+      <w:lvlText w:val="o"/>
+      <w:lvlJc w:val="left"/>
+      <w:pPr>
+        <w:ind w:left="6120" w:hanging="360"/>
+      </w:pPr>
+      <w:rPr>
+        <w:rFonts w:ascii="Courier New" w:hAnsi="Courier New" w:cs="Courier New" w:hint="default"/>
+      </w:rPr>
+    </w:lvl>
+    <w:lvl w:ilvl="8" w:tplc="04090005" w:tentative="1">
+      <w:start w:val="1"/>
+      <w:numFmt w:val="bullet"/>
+      <w:lvlText w:val=""/>
+      <w:lvlJc w:val="left"/>
+      <w:pPr>
+        <w:ind w:left="6840" w:hanging="360"/>
+      </w:pPr>
+      <w:rPr>
+        <w:rFonts w:ascii="Wingdings" w:hAnsi="Wingdings" w:hint="default"/>
+      </w:rPr>
+    </w:lvl>
+  </w:abstractNum>
+  <w:abstractNum w:abstractNumId="11" w15:restartNumberingAfterBreak="0">
+    <w:nsid w:val="07E63266"/>
+    <w:multiLevelType w:val="multilevel"/>
+    <w:tmpl w:val="C16845FE"/>
+    <w:lvl w:ilvl="0">
+      <w:start w:val="1"/>
+      <w:numFmt w:val="decimal"/>
+      <w:lvlText w:val="%1."/>
+      <w:lvlJc w:val="left"/>
+      <w:pPr>
+        <w:ind w:left="360" w:hanging="360"/>
+      </w:pPr>
+    </w:lvl>
+    <w:lvl w:ilvl="1">
+      <w:start w:val="1"/>
+      <w:numFmt w:val="bullet"/>
+      <w:lvlText w:val=""/>
+      <w:lvlJc w:val="left"/>
+      <w:pPr>
+        <w:ind w:left="720" w:hanging="360"/>
+      </w:pPr>
+      <w:rPr>
+        <w:rFonts w:ascii="Symbol" w:hAnsi="Symbol" w:hint="default"/>
+      </w:rPr>
+    </w:lvl>
+    <w:lvl w:ilvl="2">
+      <w:start w:val="1"/>
+      <w:numFmt w:val="decimal"/>
+      <w:lvlText w:val="%1.%2.%3."/>
+      <w:lvlJc w:val="left"/>
+      <w:pPr>
+        <w:ind w:left="1224" w:hanging="504"/>
+      </w:pPr>
+    </w:lvl>
+    <w:lvl w:ilvl="3">
+      <w:start w:val="1"/>
+      <w:numFmt w:val="decimal"/>
+      <w:lvlText w:val="%1.%2.%3.%4."/>
+      <w:lvlJc w:val="left"/>
+      <w:pPr>
+        <w:ind w:left="1728" w:hanging="648"/>
+      </w:pPr>
+    </w:lvl>
+    <w:lvl w:ilvl="4">
+      <w:start w:val="1"/>
+      <w:numFmt w:val="decimal"/>
+      <w:lvlText w:val="%1.%2.%3.%4.%5."/>
+      <w:lvlJc w:val="left"/>
+      <w:pPr>
+        <w:ind w:left="2232" w:hanging="792"/>
+      </w:pPr>
+    </w:lvl>
+    <w:lvl w:ilvl="5">
+      <w:start w:val="1"/>
+      <w:numFmt w:val="decimal"/>
+      <w:lvlText w:val="%1.%2.%3.%4.%5.%6."/>
+      <w:lvlJc w:val="left"/>
+      <w:pPr>
+        <w:ind w:left="2736" w:hanging="936"/>
+      </w:pPr>
+    </w:lvl>
+    <w:lvl w:ilvl="6">
+      <w:start w:val="1"/>
+      <w:numFmt w:val="decimal"/>
+      <w:lvlText w:val="%1.%2.%3.%4.%5.%6.%7."/>
+      <w:lvlJc w:val="left"/>
+      <w:pPr>
+        <w:ind w:left="3240" w:hanging="1080"/>
+      </w:pPr>
+    </w:lvl>
+    <w:lvl w:ilvl="7">
+      <w:start w:val="1"/>
+      <w:numFmt w:val="decimal"/>
+      <w:lvlText w:val="%1.%2.%3.%4.%5.%6.%7.%8."/>
+      <w:lvlJc w:val="left"/>
+      <w:pPr>
+        <w:ind w:left="3744" w:hanging="1224"/>
+      </w:pPr>
+    </w:lvl>
+    <w:lvl w:ilvl="8">
+      <w:start w:val="1"/>
+      <w:numFmt w:val="decimal"/>
+      <w:lvlText w:val="%1.%2.%3.%4.%5.%6.%7.%8.%9."/>
+      <w:lvlJc w:val="left"/>
+      <w:pPr>
+        <w:ind w:left="4320" w:hanging="1440"/>
+      </w:pPr>
+    </w:lvl>
+  </w:abstractNum>
+  <w:abstractNum w:abstractNumId="12" w15:restartNumberingAfterBreak="0">
+    <w:nsid w:val="08AE32F1"/>
+    <w:multiLevelType w:val="multilevel"/>
+    <w:tmpl w:val="F82A260A"/>
+    <w:lvl w:ilvl="0">
+      <w:start w:val="1"/>
+      <w:numFmt w:val="bullet"/>
+      <w:lvlText w:val=""/>
+      <w:lvlJc w:val="left"/>
+      <w:pPr>
+        <w:tabs>
+          <w:tab w:val="num" w:pos="720"/>
+        </w:tabs>
+        <w:ind w:left="720" w:hanging="360"/>
+      </w:pPr>
+      <w:rPr>
+        <w:rFonts w:ascii="Symbol" w:hAnsi="Symbol" w:hint="default"/>
+        <w:sz w:val="20"/>
+      </w:rPr>
+    </w:lvl>
+    <w:lvl w:ilvl="1">
+      <w:start w:val="1"/>
+      <w:numFmt w:val="bullet"/>
+      <w:lvlText w:val="o"/>
+      <w:lvlJc w:val="left"/>
+      <w:pPr>
+        <w:tabs>
+          <w:tab w:val="num" w:pos="1440"/>
+        </w:tabs>
+        <w:ind w:left="1440" w:hanging="360"/>
+      </w:pPr>
+      <w:rPr>
+        <w:rFonts w:ascii="Courier New" w:hAnsi="Courier New" w:hint="default"/>
+        <w:sz w:val="20"/>
+      </w:rPr>
+    </w:lvl>
+    <w:lvl w:ilvl="2" w:tentative="1">
+      <w:start w:val="1"/>
+      <w:numFmt w:val="bullet"/>
+      <w:lvlText w:val=""/>
+      <w:lvlJc w:val="left"/>
+      <w:pPr>
+        <w:tabs>
+          <w:tab w:val="num" w:pos="2160"/>
+        </w:tabs>
+        <w:ind w:left="2160" w:hanging="360"/>
+      </w:pPr>
+      <w:rPr>
+        <w:rFonts w:ascii="Wingdings" w:hAnsi="Wingdings" w:hint="default"/>
+        <w:sz w:val="20"/>
+      </w:rPr>
+    </w:lvl>
+    <w:lvl w:ilvl="3" w:tentative="1">
+      <w:start w:val="1"/>
+      <w:numFmt w:val="bullet"/>
+      <w:lvlText w:val=""/>
+      <w:lvlJc w:val="left"/>
+      <w:pPr>
+        <w:tabs>
+          <w:tab w:val="num" w:pos="2880"/>
+        </w:tabs>
+        <w:ind w:left="2880" w:hanging="360"/>
+      </w:pPr>
+      <w:rPr>
+        <w:rFonts w:ascii="Wingdings" w:hAnsi="Wingdings" w:hint="default"/>
+        <w:sz w:val="20"/>
+      </w:rPr>
+    </w:lvl>
+    <w:lvl w:ilvl="4" w:tentative="1">
+      <w:start w:val="1"/>
+      <w:numFmt w:val="bullet"/>
+      <w:lvlText w:val=""/>
+      <w:lvlJc w:val="left"/>
+      <w:pPr>
+        <w:tabs>
+          <w:tab w:val="num" w:pos="3600"/>
+        </w:tabs>
+        <w:ind w:left="3600" w:hanging="360"/>
+      </w:pPr>
+      <w:rPr>
+        <w:rFonts w:ascii="Wingdings" w:hAnsi="Wingdings" w:hint="default"/>
+        <w:sz w:val="20"/>
+      </w:rPr>
+    </w:lvl>
+    <w:lvl w:ilvl="5" w:tentative="1">
+      <w:start w:val="1"/>
+      <w:numFmt w:val="bullet"/>
+      <w:lvlText w:val=""/>
+      <w:lvlJc w:val="left"/>
+      <w:pPr>
+        <w:tabs>
+          <w:tab w:val="num" w:pos="4320"/>
+        </w:tabs>
+        <w:ind w:left="4320" w:hanging="360"/>
+      </w:pPr>
+      <w:rPr>
+        <w:rFonts w:ascii="Wingdings" w:hAnsi="Wingdings" w:hint="default"/>
+        <w:sz w:val="20"/>
+      </w:rPr>
+    </w:lvl>
+    <w:lvl w:ilvl="6" w:tentative="1">
+      <w:start w:val="1"/>
+      <w:numFmt w:val="bullet"/>
+      <w:lvlText w:val=""/>
+      <w:lvlJc w:val="left"/>
+      <w:pPr>
+        <w:tabs>
+          <w:tab w:val="num" w:pos="5040"/>
+        </w:tabs>
+        <w:ind w:left="5040" w:hanging="360"/>
+      </w:pPr>
+      <w:rPr>
+        <w:rFonts w:ascii="Wingdings" w:hAnsi="Wingdings" w:hint="default"/>
+        <w:sz w:val="20"/>
+      </w:rPr>
+    </w:lvl>
+    <w:lvl w:ilvl="7" w:tentative="1">
+      <w:start w:val="1"/>
+      <w:numFmt w:val="bullet"/>
+      <w:lvlText w:val=""/>
+      <w:lvlJc w:val="left"/>
+      <w:pPr>
+        <w:tabs>
+          <w:tab w:val="num" w:pos="5760"/>
+        </w:tabs>
+        <w:ind w:left="5760" w:hanging="360"/>
+      </w:pPr>
+      <w:rPr>
+        <w:rFonts w:ascii="Wingdings" w:hAnsi="Wingdings" w:hint="default"/>
+        <w:sz w:val="20"/>
+      </w:rPr>
+    </w:lvl>
+    <w:lvl w:ilvl="8" w:tentative="1">
+      <w:start w:val="1"/>
+      <w:numFmt w:val="bullet"/>
+      <w:lvlText w:val=""/>
+      <w:lvlJc w:val="left"/>
+      <w:pPr>
+        <w:tabs>
+          <w:tab w:val="num" w:pos="6480"/>
+        </w:tabs>
+        <w:ind w:left="6480" w:hanging="360"/>
+      </w:pPr>
+      <w:rPr>
+        <w:rFonts w:ascii="Wingdings" w:hAnsi="Wingdings" w:hint="default"/>
+        <w:sz w:val="20"/>
+      </w:rPr>
+    </w:lvl>
+  </w:abstractNum>
+  <w:abstractNum w:abstractNumId="13" w15:restartNumberingAfterBreak="0">
+    <w:nsid w:val="13666A67"/>
+    <w:multiLevelType w:val="multilevel"/>
+    <w:tmpl w:val="C16845FE"/>
+    <w:lvl w:ilvl="0">
+      <w:start w:val="1"/>
+      <w:numFmt w:val="decimal"/>
+      <w:lvlText w:val="%1."/>
+      <w:lvlJc w:val="left"/>
+      <w:pPr>
+        <w:ind w:left="360" w:hanging="360"/>
+      </w:pPr>
+    </w:lvl>
+    <w:lvl w:ilvl="1">
+      <w:start w:val="1"/>
+      <w:numFmt w:val="bullet"/>
+      <w:lvlText w:val=""/>
+      <w:lvlJc w:val="left"/>
+      <w:pPr>
+        <w:ind w:left="720" w:hanging="360"/>
+      </w:pPr>
+      <w:rPr>
+        <w:rFonts w:ascii="Symbol" w:hAnsi="Symbol" w:hint="default"/>
+      </w:rPr>
+    </w:lvl>
+    <w:lvl w:ilvl="2">
+      <w:start w:val="1"/>
+      <w:numFmt w:val="decimal"/>
+      <w:lvlText w:val="%1.%2.%3."/>
+      <w:lvlJc w:val="left"/>
+      <w:pPr>
+        <w:ind w:left="1224" w:hanging="504"/>
+      </w:pPr>
+    </w:lvl>
+    <w:lvl w:ilvl="3">
+      <w:start w:val="1"/>
+      <w:numFmt w:val="decimal"/>
+      <w:lvlText w:val="%1.%2.%3.%4."/>
+      <w:lvlJc w:val="left"/>
+      <w:pPr>
+        <w:ind w:left="1728" w:hanging="648"/>
+      </w:pPr>
+    </w:lvl>
+    <w:lvl w:ilvl="4">
+      <w:start w:val="1"/>
+      <w:numFmt w:val="decimal"/>
+      <w:lvlText w:val="%1.%2.%3.%4.%5."/>
+      <w:lvlJc w:val="left"/>
+      <w:pPr>
+        <w:ind w:left="2232" w:hanging="792"/>
+      </w:pPr>
+    </w:lvl>
+    <w:lvl w:ilvl="5">
+      <w:start w:val="1"/>
+      <w:numFmt w:val="decimal"/>
+      <w:lvlText w:val="%1.%2.%3.%4.%5.%6."/>
+      <w:lvlJc w:val="left"/>
+      <w:pPr>
+        <w:ind w:left="2736" w:hanging="936"/>
+      </w:pPr>
+    </w:lvl>
+    <w:lvl w:ilvl="6">
+      <w:start w:val="1"/>
+      <w:numFmt w:val="decimal"/>
+      <w:lvlText w:val="%1.%2.%3.%4.%5.%6.%7."/>
+      <w:lvlJc w:val="left"/>
+      <w:pPr>
+        <w:ind w:left="3240" w:hanging="1080"/>
+      </w:pPr>
+    </w:lvl>
+    <w:lvl w:ilvl="7">
+      <w:start w:val="1"/>
+      <w:numFmt w:val="decimal"/>
+      <w:lvlText w:val="%1.%2.%3.%4.%5.%6.%7.%8."/>
+      <w:lvlJc w:val="left"/>
+      <w:pPr>
+        <w:ind w:left="3744" w:hanging="1224"/>
+      </w:pPr>
+    </w:lvl>
+    <w:lvl w:ilvl="8">
+      <w:start w:val="1"/>
+      <w:numFmt w:val="decimal"/>
+      <w:lvlText w:val="%1.%2.%3.%4.%5.%6.%7.%8.%9."/>
+      <w:lvlJc w:val="left"/>
+      <w:pPr>
+        <w:ind w:left="4320" w:hanging="1440"/>
+      </w:pPr>
+    </w:lvl>
+  </w:abstractNum>
+  <w:abstractNum w:abstractNumId="14" w15:restartNumberingAfterBreak="0">
+    <w:nsid w:val="23E718C8"/>
+    <w:multiLevelType w:val="hybridMultilevel"/>
+    <w:tmpl w:val="ECD08694"/>
+    <w:lvl w:ilvl="0" w:tplc="04090001">
+      <w:start w:val="1"/>
+      <w:numFmt w:val="bullet"/>
+      <w:lvlText w:val=""/>
+      <w:lvlJc w:val="left"/>
+      <w:pPr>
+        <w:ind w:left="1080" w:hanging="360"/>
+      </w:pPr>
+      <w:rPr>
+        <w:rFonts w:ascii="Symbol" w:hAnsi="Symbol" w:hint="default"/>
+      </w:rPr>
+    </w:lvl>
+    <w:lvl w:ilvl="1" w:tplc="04090003" w:tentative="1">
+      <w:start w:val="1"/>
+      <w:numFmt w:val="bullet"/>
+      <w:lvlText w:val="o"/>
+      <w:lvlJc w:val="left"/>
+      <w:pPr>
+        <w:ind w:left="1800" w:hanging="360"/>
+      </w:pPr>
+      <w:rPr>
+        <w:rFonts w:ascii="Courier New" w:hAnsi="Courier New" w:cs="Courier New" w:hint="default"/>
+      </w:rPr>
+    </w:lvl>
+    <w:lvl w:ilvl="2" w:tplc="04090005" w:tentative="1">
+      <w:start w:val="1"/>
+      <w:numFmt w:val="bullet"/>
+      <w:lvlText w:val=""/>
+      <w:lvlJc w:val="left"/>
+      <w:pPr>
+        <w:ind w:left="2520" w:hanging="360"/>
+      </w:pPr>
+      <w:rPr>
+        <w:rFonts w:ascii="Wingdings" w:hAnsi="Wingdings" w:hint="default"/>
+      </w:rPr>
+    </w:lvl>
+    <w:lvl w:ilvl="3" w:tplc="04090001" w:tentative="1">
+      <w:start w:val="1"/>
+      <w:numFmt w:val="bullet"/>
+      <w:lvlText w:val=""/>
+      <w:lvlJc w:val="left"/>
+      <w:pPr>
+        <w:ind w:left="3240" w:hanging="360"/>
+      </w:pPr>
+      <w:rPr>
+        <w:rFonts w:ascii="Symbol" w:hAnsi="Symbol" w:hint="default"/>
+      </w:rPr>
+    </w:lvl>
+    <w:lvl w:ilvl="4" w:tplc="04090003" w:tentative="1">
+      <w:start w:val="1"/>
+      <w:numFmt w:val="bullet"/>
+      <w:lvlText w:val="o"/>
+      <w:lvlJc w:val="left"/>
+      <w:pPr>
+        <w:ind w:left="3960" w:hanging="360"/>
+      </w:pPr>
+      <w:rPr>
+        <w:rFonts w:ascii="Courier New" w:hAnsi="Courier New" w:cs="Courier New" w:hint="default"/>
+      </w:rPr>
+    </w:lvl>
+    <w:lvl w:ilvl="5" w:tplc="04090005" w:tentative="1">
+      <w:start w:val="1"/>
+      <w:numFmt w:val="bullet"/>
+      <w:lvlText w:val=""/>
+      <w:lvlJc w:val="left"/>
+      <w:pPr>
+        <w:ind w:left="4680" w:hanging="360"/>
+      </w:pPr>
+      <w:rPr>
+        <w:rFonts w:ascii="Wingdings" w:hAnsi="Wingdings" w:hint="default"/>
+      </w:rPr>
+    </w:lvl>
+    <w:lvl w:ilvl="6" w:tplc="04090001" w:tentative="1">
+      <w:start w:val="1"/>
+      <w:numFmt w:val="bullet"/>
+      <w:lvlText w:val=""/>
+      <w:lvlJc w:val="left"/>
+      <w:pPr>
+        <w:ind w:left="5400" w:hanging="360"/>
+      </w:pPr>
+      <w:rPr>
+        <w:rFonts w:ascii="Symbol" w:hAnsi="Symbol" w:hint="default"/>
+      </w:rPr>
+    </w:lvl>
+    <w:lvl w:ilvl="7" w:tplc="04090003" w:tentative="1">
+      <w:start w:val="1"/>
+      <w:numFmt w:val="bullet"/>
+      <w:lvlText w:val="o"/>
+      <w:lvlJc w:val="left"/>
+      <w:pPr>
+        <w:ind w:left="6120" w:hanging="360"/>
+      </w:pPr>
+      <w:rPr>
+        <w:rFonts w:ascii="Courier New" w:hAnsi="Courier New" w:cs="Courier New" w:hint="default"/>
+      </w:rPr>
+    </w:lvl>
+    <w:lvl w:ilvl="8" w:tplc="04090005" w:tentative="1">
+      <w:start w:val="1"/>
+      <w:numFmt w:val="bullet"/>
+      <w:lvlText w:val=""/>
+      <w:lvlJc w:val="left"/>
+      <w:pPr>
+        <w:ind w:left="6840" w:hanging="360"/>
+      </w:pPr>
+      <w:rPr>
+        <w:rFonts w:ascii="Wingdings" w:hAnsi="Wingdings" w:hint="default"/>
+      </w:rPr>
+    </w:lvl>
+  </w:abstractNum>
+  <w:abstractNum w:abstractNumId="15" w15:restartNumberingAfterBreak="0">
+    <w:nsid w:val="265429AF"/>
+    <w:multiLevelType w:val="multilevel"/>
+    <w:tmpl w:val="64AA33B4"/>
+    <w:lvl w:ilvl="0">
+      <w:start w:val="1"/>
+      <w:numFmt w:val="bullet"/>
+      <w:lvlText w:val=""/>
+      <w:lvlJc w:val="left"/>
+      <w:pPr>
+        <w:ind w:left="1080" w:hanging="360"/>
+      </w:pPr>
+      <w:rPr>
+        <w:rFonts w:ascii="Symbol" w:hAnsi="Symbol" w:hint="default"/>
+      </w:rPr>
+    </w:lvl>
+    <w:lvl w:ilvl="1">
+      <w:start w:val="1"/>
+      <w:numFmt w:val="bullet"/>
+      <w:lvlText w:val=""/>
+      <w:lvlJc w:val="left"/>
+      <w:pPr>
+        <w:ind w:left="1440" w:hanging="360"/>
+      </w:pPr>
+      <w:rPr>
+        <w:rFonts w:ascii="Symbol" w:hAnsi="Symbol" w:hint="default"/>
+      </w:rPr>
+    </w:lvl>
+    <w:lvl w:ilvl="2">
+      <w:start w:val="1"/>
+      <w:numFmt w:val="decimal"/>
+      <w:lvlText w:val="%1.%2.%3."/>
+      <w:lvlJc w:val="left"/>
+      <w:pPr>
+        <w:ind w:left="1944" w:hanging="504"/>
+      </w:pPr>
+    </w:lvl>
+    <w:lvl w:ilvl="3">
+      <w:start w:val="1"/>
+      <w:numFmt w:val="decimal"/>
+      <w:lvlText w:val="%1.%2.%3.%4."/>
+      <w:lvlJc w:val="left"/>
+      <w:pPr>
+        <w:ind w:left="2448" w:hanging="648"/>
+      </w:pPr>
+    </w:lvl>
+    <w:lvl w:ilvl="4">
+      <w:start w:val="1"/>
+      <w:numFmt w:val="decimal"/>
+      <w:lvlText w:val="%1.%2.%3.%4.%5."/>
+      <w:lvlJc w:val="left"/>
+      <w:pPr>
+        <w:ind w:left="2952" w:hanging="792"/>
+      </w:pPr>
+    </w:lvl>
+    <w:lvl w:ilvl="5">
+      <w:start w:val="1"/>
+      <w:numFmt w:val="decimal"/>
+      <w:lvlText w:val="%1.%2.%3.%4.%5.%6."/>
+      <w:lvlJc w:val="left"/>
+      <w:pPr>
+        <w:ind w:left="3456" w:hanging="936"/>
+      </w:pPr>
+    </w:lvl>
+    <w:lvl w:ilvl="6">
+      <w:start w:val="1"/>
+      <w:numFmt w:val="decimal"/>
+      <w:lvlText w:val="%1.%2.%3.%4.%5.%6.%7."/>
+      <w:lvlJc w:val="left"/>
+      <w:pPr>
+        <w:ind w:left="3960" w:hanging="1080"/>
+      </w:pPr>
+    </w:lvl>
+    <w:lvl w:ilvl="7">
+      <w:start w:val="1"/>
+      <w:numFmt w:val="decimal"/>
+      <w:lvlText w:val="%1.%2.%3.%4.%5.%6.%7.%8."/>
+      <w:lvlJc w:val="left"/>
+      <w:pPr>
+        <w:ind w:left="4464" w:hanging="1224"/>
+      </w:pPr>
+    </w:lvl>
+    <w:lvl w:ilvl="8">
+      <w:start w:val="1"/>
+      <w:numFmt w:val="decimal"/>
+      <w:lvlText w:val="%1.%2.%3.%4.%5.%6.%7.%8.%9."/>
+      <w:lvlJc w:val="left"/>
+      <w:pPr>
+        <w:ind w:left="5040" w:hanging="1440"/>
+      </w:pPr>
+    </w:lvl>
+  </w:abstractNum>
+  <w:abstractNum w:abstractNumId="16" w15:restartNumberingAfterBreak="0">
+    <w:nsid w:val="27552DEC"/>
+    <w:multiLevelType w:val="hybridMultilevel"/>
+    <w:tmpl w:val="DBBA2E62"/>
+    <w:lvl w:ilvl="0" w:tplc="04090001">
+      <w:start w:val="1"/>
+      <w:numFmt w:val="bullet"/>
+      <w:lvlText w:val=""/>
+      <w:lvlJc w:val="left"/>
+      <w:pPr>
+        <w:ind w:left="1080" w:hanging="360"/>
+      </w:pPr>
+      <w:rPr>
+        <w:rFonts w:ascii="Symbol" w:hAnsi="Symbol" w:hint="default"/>
+      </w:rPr>
+    </w:lvl>
+    <w:lvl w:ilvl="1" w:tplc="04090003" w:tentative="1">
+      <w:start w:val="1"/>
+      <w:numFmt w:val="bullet"/>
+      <w:lvlText w:val="o"/>
+      <w:lvlJc w:val="left"/>
+      <w:pPr>
+        <w:ind w:left="1800" w:hanging="360"/>
+      </w:pPr>
+      <w:rPr>
+        <w:rFonts w:ascii="Courier New" w:hAnsi="Courier New" w:cs="Courier New" w:hint="default"/>
+      </w:rPr>
+    </w:lvl>
+    <w:lvl w:ilvl="2" w:tplc="04090005" w:tentative="1">
+      <w:start w:val="1"/>
+      <w:numFmt w:val="bullet"/>
+      <w:lvlText w:val=""/>
+      <w:lvlJc w:val="left"/>
+      <w:pPr>
+        <w:ind w:left="2520" w:hanging="360"/>
+      </w:pPr>
+      <w:rPr>
+        <w:rFonts w:ascii="Wingdings" w:hAnsi="Wingdings" w:hint="default"/>
+      </w:rPr>
+    </w:lvl>
+    <w:lvl w:ilvl="3" w:tplc="04090001" w:tentative="1">
+      <w:start w:val="1"/>
+      <w:numFmt w:val="bullet"/>
+      <w:lvlText w:val=""/>
+      <w:lvlJc w:val="left"/>
+      <w:pPr>
+        <w:ind w:left="3240" w:hanging="360"/>
+      </w:pPr>
+      <w:rPr>
+        <w:rFonts w:ascii="Symbol" w:hAnsi="Symbol" w:hint="default"/>
+      </w:rPr>
+    </w:lvl>
+    <w:lvl w:ilvl="4" w:tplc="04090003" w:tentative="1">
+      <w:start w:val="1"/>
+      <w:numFmt w:val="bullet"/>
+      <w:lvlText w:val="o"/>
+      <w:lvlJc w:val="left"/>
+      <w:pPr>
+        <w:ind w:left="3960" w:hanging="360"/>
+      </w:pPr>
+      <w:rPr>
+        <w:rFonts w:ascii="Courier New" w:hAnsi="Courier New" w:cs="Courier New" w:hint="default"/>
+      </w:rPr>
+    </w:lvl>
+    <w:lvl w:ilvl="5" w:tplc="04090005" w:tentative="1">
+      <w:start w:val="1"/>
+      <w:numFmt w:val="bullet"/>
+      <w:lvlText w:val=""/>
+      <w:lvlJc w:val="left"/>
+      <w:pPr>
+        <w:ind w:left="4680" w:hanging="360"/>
+      </w:pPr>
+      <w:rPr>
+        <w:rFonts w:ascii="Wingdings" w:hAnsi="Wingdings" w:hint="default"/>
+      </w:rPr>
+    </w:lvl>
+    <w:lvl w:ilvl="6" w:tplc="04090001" w:tentative="1">
+      <w:start w:val="1"/>
+      <w:numFmt w:val="bullet"/>
+      <w:lvlText w:val=""/>
+      <w:lvlJc w:val="left"/>
+      <w:pPr>
+        <w:ind w:left="5400" w:hanging="360"/>
+      </w:pPr>
+      <w:rPr>
+        <w:rFonts w:ascii="Symbol" w:hAnsi="Symbol" w:hint="default"/>
+      </w:rPr>
+    </w:lvl>
+    <w:lvl w:ilvl="7" w:tplc="04090003" w:tentative="1">
+      <w:start w:val="1"/>
+      <w:numFmt w:val="bullet"/>
+      <w:lvlText w:val="o"/>
+      <w:lvlJc w:val="left"/>
+      <w:pPr>
+        <w:ind w:left="6120" w:hanging="360"/>
+      </w:pPr>
+      <w:rPr>
+        <w:rFonts w:ascii="Courier New" w:hAnsi="Courier New" w:cs="Courier New" w:hint="default"/>
+      </w:rPr>
+    </w:lvl>
+    <w:lvl w:ilvl="8" w:tplc="04090005" w:tentative="1">
+      <w:start w:val="1"/>
+      <w:numFmt w:val="bullet"/>
+      <w:lvlText w:val=""/>
+      <w:lvlJc w:val="left"/>
+      <w:pPr>
+        <w:ind w:left="6840" w:hanging="360"/>
+      </w:pPr>
+      <w:rPr>
+        <w:rFonts w:ascii="Wingdings" w:hAnsi="Wingdings" w:hint="default"/>
+      </w:rPr>
+    </w:lvl>
+  </w:abstractNum>
+  <w:abstractNum w:abstractNumId="17" w15:restartNumberingAfterBreak="0">
+    <w:nsid w:val="29D20BCF"/>
+    <w:multiLevelType w:val="multilevel"/>
+    <w:tmpl w:val="5330D47C"/>
+    <w:lvl w:ilvl="0">
+      <w:start w:val="1"/>
+      <w:numFmt w:val="bullet"/>
+      <w:lvlText w:val=""/>
+      <w:lvlJc w:val="left"/>
+      <w:pPr>
+        <w:tabs>
+          <w:tab w:val="num" w:pos="720"/>
+        </w:tabs>
+        <w:ind w:left="720" w:hanging="360"/>
+      </w:pPr>
+      <w:rPr>
+        <w:rFonts w:ascii="Symbol" w:hAnsi="Symbol" w:hint="default"/>
+        <w:sz w:val="20"/>
+      </w:rPr>
+    </w:lvl>
+    <w:lvl w:ilvl="1" w:tentative="1">
+      <w:start w:val="1"/>
+      <w:numFmt w:val="bullet"/>
+      <w:lvlText w:val="o"/>
+      <w:lvlJc w:val="left"/>
+      <w:pPr>
+        <w:tabs>
+          <w:tab w:val="num" w:pos="1440"/>
+        </w:tabs>
+        <w:ind w:left="1440" w:hanging="360"/>
+      </w:pPr>
+      <w:rPr>
+        <w:rFonts w:ascii="Courier New" w:hAnsi="Courier New" w:hint="default"/>
+        <w:sz w:val="20"/>
+      </w:rPr>
+    </w:lvl>
+    <w:lvl w:ilvl="2" w:tentative="1">
+      <w:start w:val="1"/>
+      <w:numFmt w:val="bullet"/>
+      <w:lvlText w:val=""/>
+      <w:lvlJc w:val="left"/>
+      <w:pPr>
+        <w:tabs>
+          <w:tab w:val="num" w:pos="2160"/>
+        </w:tabs>
+        <w:ind w:left="2160" w:hanging="360"/>
+      </w:pPr>
+      <w:rPr>
+        <w:rFonts w:ascii="Wingdings" w:hAnsi="Wingdings" w:hint="default"/>
+        <w:sz w:val="20"/>
+      </w:rPr>
+    </w:lvl>
+    <w:lvl w:ilvl="3" w:tentative="1">
+      <w:start w:val="1"/>
+      <w:numFmt w:val="bullet"/>
+      <w:lvlText w:val=""/>
+      <w:lvlJc w:val="left"/>
+      <w:pPr>
+        <w:tabs>
+          <w:tab w:val="num" w:pos="2880"/>
+        </w:tabs>
+        <w:ind w:left="2880" w:hanging="360"/>
+      </w:pPr>
+      <w:rPr>
+        <w:rFonts w:ascii="Wingdings" w:hAnsi="Wingdings" w:hint="default"/>
+        <w:sz w:val="20"/>
+      </w:rPr>
+    </w:lvl>
+    <w:lvl w:ilvl="4" w:tentative="1">
+      <w:start w:val="1"/>
+      <w:numFmt w:val="bullet"/>
+      <w:lvlText w:val=""/>
+      <w:lvlJc w:val="left"/>
+      <w:pPr>
+        <w:tabs>
+          <w:tab w:val="num" w:pos="3600"/>
+        </w:tabs>
+        <w:ind w:left="3600" w:hanging="360"/>
+      </w:pPr>
+      <w:rPr>
+        <w:rFonts w:ascii="Wingdings" w:hAnsi="Wingdings" w:hint="default"/>
+        <w:sz w:val="20"/>
+      </w:rPr>
+    </w:lvl>
+    <w:lvl w:ilvl="5" w:tentative="1">
+      <w:start w:val="1"/>
+      <w:numFmt w:val="bullet"/>
+      <w:lvlText w:val=""/>
+      <w:lvlJc w:val="left"/>
+      <w:pPr>
+        <w:tabs>
+          <w:tab w:val="num" w:pos="4320"/>
+        </w:tabs>
+        <w:ind w:left="4320" w:hanging="360"/>
+      </w:pPr>
+      <w:rPr>
+        <w:rFonts w:ascii="Wingdings" w:hAnsi="Wingdings" w:hint="default"/>
+        <w:sz w:val="20"/>
+      </w:rPr>
+    </w:lvl>
+    <w:lvl w:ilvl="6" w:tentative="1">
+      <w:start w:val="1"/>
+      <w:numFmt w:val="bullet"/>
+      <w:lvlText w:val=""/>
+      <w:lvlJc w:val="left"/>
+      <w:pPr>
+        <w:tabs>
+          <w:tab w:val="num" w:pos="5040"/>
+        </w:tabs>
+        <w:ind w:left="5040" w:hanging="360"/>
+      </w:pPr>
+      <w:rPr>
+        <w:rFonts w:ascii="Wingdings" w:hAnsi="Wingdings" w:hint="default"/>
+        <w:sz w:val="20"/>
+      </w:rPr>
+    </w:lvl>
+    <w:lvl w:ilvl="7" w:tentative="1">
+      <w:start w:val="1"/>
+      <w:numFmt w:val="bullet"/>
+      <w:lvlText w:val=""/>
+      <w:lvlJc w:val="left"/>
+      <w:pPr>
+        <w:tabs>
+          <w:tab w:val="num" w:pos="5760"/>
+        </w:tabs>
+        <w:ind w:left="5760" w:hanging="360"/>
+      </w:pPr>
+      <w:rPr>
+        <w:rFonts w:ascii="Wingdings" w:hAnsi="Wingdings" w:hint="default"/>
+        <w:sz w:val="20"/>
+      </w:rPr>
+    </w:lvl>
+    <w:lvl w:ilvl="8" w:tentative="1">
+      <w:start w:val="1"/>
+      <w:numFmt w:val="bullet"/>
+      <w:lvlText w:val=""/>
+      <w:lvlJc w:val="left"/>
+      <w:pPr>
+        <w:tabs>
+          <w:tab w:val="num" w:pos="6480"/>
+        </w:tabs>
+        <w:ind w:left="6480" w:hanging="360"/>
+      </w:pPr>
+      <w:rPr>
+        <w:rFonts w:ascii="Wingdings" w:hAnsi="Wingdings" w:hint="default"/>
+        <w:sz w:val="20"/>
+      </w:rPr>
+    </w:lvl>
+  </w:abstractNum>
+  <w:abstractNum w:abstractNumId="18" w15:restartNumberingAfterBreak="0">
     <w:nsid w:val="40356D56"/>
     <w:multiLevelType w:val="hybridMultilevel"/>
     <w:tmpl w:val="2B42D4C6"/>
@@ -3652,7 +5563,361 @@
       </w:pPr>
     </w:lvl>
   </w:abstractNum>
-  <w:abstractNum w:abstractNumId="11" w15:restartNumberingAfterBreak="0">
+  <w:abstractNum w:abstractNumId="19" w15:restartNumberingAfterBreak="0">
+    <w:nsid w:val="46654CA8"/>
+    <w:multiLevelType w:val="multilevel"/>
+    <w:tmpl w:val="64AA33B4"/>
+    <w:lvl w:ilvl="0">
+      <w:start w:val="1"/>
+      <w:numFmt w:val="bullet"/>
+      <w:lvlText w:val=""/>
+      <w:lvlJc w:val="left"/>
+      <w:pPr>
+        <w:ind w:left="1080" w:hanging="360"/>
+      </w:pPr>
+      <w:rPr>
+        <w:rFonts w:ascii="Symbol" w:hAnsi="Symbol" w:hint="default"/>
+      </w:rPr>
+    </w:lvl>
+    <w:lvl w:ilvl="1">
+      <w:start w:val="1"/>
+      <w:numFmt w:val="bullet"/>
+      <w:lvlText w:val=""/>
+      <w:lvlJc w:val="left"/>
+      <w:pPr>
+        <w:ind w:left="1440" w:hanging="360"/>
+      </w:pPr>
+      <w:rPr>
+        <w:rFonts w:ascii="Symbol" w:hAnsi="Symbol" w:hint="default"/>
+      </w:rPr>
+    </w:lvl>
+    <w:lvl w:ilvl="2">
+      <w:start w:val="1"/>
+      <w:numFmt w:val="decimal"/>
+      <w:lvlText w:val="%1.%2.%3."/>
+      <w:lvlJc w:val="left"/>
+      <w:pPr>
+        <w:ind w:left="1944" w:hanging="504"/>
+      </w:pPr>
+    </w:lvl>
+    <w:lvl w:ilvl="3">
+      <w:start w:val="1"/>
+      <w:numFmt w:val="decimal"/>
+      <w:lvlText w:val="%1.%2.%3.%4."/>
+      <w:lvlJc w:val="left"/>
+      <w:pPr>
+        <w:ind w:left="2448" w:hanging="648"/>
+      </w:pPr>
+    </w:lvl>
+    <w:lvl w:ilvl="4">
+      <w:start w:val="1"/>
+      <w:numFmt w:val="decimal"/>
+      <w:lvlText w:val="%1.%2.%3.%4.%5."/>
+      <w:lvlJc w:val="left"/>
+      <w:pPr>
+        <w:ind w:left="2952" w:hanging="792"/>
+      </w:pPr>
+    </w:lvl>
+    <w:lvl w:ilvl="5">
+      <w:start w:val="1"/>
+      <w:numFmt w:val="decimal"/>
+      <w:lvlText w:val="%1.%2.%3.%4.%5.%6."/>
+      <w:lvlJc w:val="left"/>
+      <w:pPr>
+        <w:ind w:left="3456" w:hanging="936"/>
+      </w:pPr>
+    </w:lvl>
+    <w:lvl w:ilvl="6">
+      <w:start w:val="1"/>
+      <w:numFmt w:val="decimal"/>
+      <w:lvlText w:val="%1.%2.%3.%4.%5.%6.%7."/>
+      <w:lvlJc w:val="left"/>
+      <w:pPr>
+        <w:ind w:left="3960" w:hanging="1080"/>
+      </w:pPr>
+    </w:lvl>
+    <w:lvl w:ilvl="7">
+      <w:start w:val="1"/>
+      <w:numFmt w:val="decimal"/>
+      <w:lvlText w:val="%1.%2.%3.%4.%5.%6.%7.%8."/>
+      <w:lvlJc w:val="left"/>
+      <w:pPr>
+        <w:ind w:left="4464" w:hanging="1224"/>
+      </w:pPr>
+    </w:lvl>
+    <w:lvl w:ilvl="8">
+      <w:start w:val="1"/>
+      <w:numFmt w:val="decimal"/>
+      <w:lvlText w:val="%1.%2.%3.%4.%5.%6.%7.%8.%9."/>
+      <w:lvlJc w:val="left"/>
+      <w:pPr>
+        <w:ind w:left="5040" w:hanging="1440"/>
+      </w:pPr>
+    </w:lvl>
+  </w:abstractNum>
+  <w:abstractNum w:abstractNumId="20" w15:restartNumberingAfterBreak="0">
+    <w:nsid w:val="4E316156"/>
+    <w:multiLevelType w:val="hybridMultilevel"/>
+    <w:tmpl w:val="C49C1332"/>
+    <w:lvl w:ilvl="0" w:tplc="04090001">
+      <w:start w:val="1"/>
+      <w:numFmt w:val="bullet"/>
+      <w:lvlText w:val=""/>
+      <w:lvlJc w:val="left"/>
+      <w:pPr>
+        <w:ind w:left="1800" w:hanging="360"/>
+      </w:pPr>
+      <w:rPr>
+        <w:rFonts w:ascii="Symbol" w:hAnsi="Symbol" w:hint="default"/>
+      </w:rPr>
+    </w:lvl>
+    <w:lvl w:ilvl="1" w:tplc="04090003" w:tentative="1">
+      <w:start w:val="1"/>
+      <w:numFmt w:val="bullet"/>
+      <w:lvlText w:val="o"/>
+      <w:lvlJc w:val="left"/>
+      <w:pPr>
+        <w:ind w:left="2520" w:hanging="360"/>
+      </w:pPr>
+      <w:rPr>
+        <w:rFonts w:ascii="Courier New" w:hAnsi="Courier New" w:cs="Courier New" w:hint="default"/>
+      </w:rPr>
+    </w:lvl>
+    <w:lvl w:ilvl="2" w:tplc="04090005" w:tentative="1">
+      <w:start w:val="1"/>
+      <w:numFmt w:val="bullet"/>
+      <w:lvlText w:val=""/>
+      <w:lvlJc w:val="left"/>
+      <w:pPr>
+        <w:ind w:left="3240" w:hanging="360"/>
+      </w:pPr>
+      <w:rPr>
+        <w:rFonts w:ascii="Wingdings" w:hAnsi="Wingdings" w:hint="default"/>
+      </w:rPr>
+    </w:lvl>
+    <w:lvl w:ilvl="3" w:tplc="04090001" w:tentative="1">
+      <w:start w:val="1"/>
+      <w:numFmt w:val="bullet"/>
+      <w:lvlText w:val=""/>
+      <w:lvlJc w:val="left"/>
+      <w:pPr>
+        <w:ind w:left="3960" w:hanging="360"/>
+      </w:pPr>
+      <w:rPr>
+        <w:rFonts w:ascii="Symbol" w:hAnsi="Symbol" w:hint="default"/>
+      </w:rPr>
+    </w:lvl>
+    <w:lvl w:ilvl="4" w:tplc="04090003" w:tentative="1">
+      <w:start w:val="1"/>
+      <w:numFmt w:val="bullet"/>
+      <w:lvlText w:val="o"/>
+      <w:lvlJc w:val="left"/>
+      <w:pPr>
+        <w:ind w:left="4680" w:hanging="360"/>
+      </w:pPr>
+      <w:rPr>
+        <w:rFonts w:ascii="Courier New" w:hAnsi="Courier New" w:cs="Courier New" w:hint="default"/>
+      </w:rPr>
+    </w:lvl>
+    <w:lvl w:ilvl="5" w:tplc="04090005" w:tentative="1">
+      <w:start w:val="1"/>
+      <w:numFmt w:val="bullet"/>
+      <w:lvlText w:val=""/>
+      <w:lvlJc w:val="left"/>
+      <w:pPr>
+        <w:ind w:left="5400" w:hanging="360"/>
+      </w:pPr>
+      <w:rPr>
+        <w:rFonts w:ascii="Wingdings" w:hAnsi="Wingdings" w:hint="default"/>
+      </w:rPr>
+    </w:lvl>
+    <w:lvl w:ilvl="6" w:tplc="04090001" w:tentative="1">
+      <w:start w:val="1"/>
+      <w:numFmt w:val="bullet"/>
+      <w:lvlText w:val=""/>
+      <w:lvlJc w:val="left"/>
+      <w:pPr>
+        <w:ind w:left="6120" w:hanging="360"/>
+      </w:pPr>
+      <w:rPr>
+        <w:rFonts w:ascii="Symbol" w:hAnsi="Symbol" w:hint="default"/>
+      </w:rPr>
+    </w:lvl>
+    <w:lvl w:ilvl="7" w:tplc="04090003" w:tentative="1">
+      <w:start w:val="1"/>
+      <w:numFmt w:val="bullet"/>
+      <w:lvlText w:val="o"/>
+      <w:lvlJc w:val="left"/>
+      <w:pPr>
+        <w:ind w:left="6840" w:hanging="360"/>
+      </w:pPr>
+      <w:rPr>
+        <w:rFonts w:ascii="Courier New" w:hAnsi="Courier New" w:cs="Courier New" w:hint="default"/>
+      </w:rPr>
+    </w:lvl>
+    <w:lvl w:ilvl="8" w:tplc="04090005" w:tentative="1">
+      <w:start w:val="1"/>
+      <w:numFmt w:val="bullet"/>
+      <w:lvlText w:val=""/>
+      <w:lvlJc w:val="left"/>
+      <w:pPr>
+        <w:ind w:left="7560" w:hanging="360"/>
+      </w:pPr>
+      <w:rPr>
+        <w:rFonts w:ascii="Wingdings" w:hAnsi="Wingdings" w:hint="default"/>
+      </w:rPr>
+    </w:lvl>
+  </w:abstractNum>
+  <w:abstractNum w:abstractNumId="21" w15:restartNumberingAfterBreak="0">
+    <w:nsid w:val="5B645C24"/>
+    <w:multiLevelType w:val="multilevel"/>
+    <w:tmpl w:val="3D287810"/>
+    <w:lvl w:ilvl="0">
+      <w:start w:val="1"/>
+      <w:numFmt w:val="bullet"/>
+      <w:lvlText w:val=""/>
+      <w:lvlJc w:val="left"/>
+      <w:pPr>
+        <w:tabs>
+          <w:tab w:val="num" w:pos="720"/>
+        </w:tabs>
+        <w:ind w:left="720" w:hanging="360"/>
+      </w:pPr>
+      <w:rPr>
+        <w:rFonts w:ascii="Symbol" w:hAnsi="Symbol" w:hint="default"/>
+        <w:sz w:val="20"/>
+      </w:rPr>
+    </w:lvl>
+    <w:lvl w:ilvl="1" w:tentative="1">
+      <w:start w:val="1"/>
+      <w:numFmt w:val="bullet"/>
+      <w:lvlText w:val="o"/>
+      <w:lvlJc w:val="left"/>
+      <w:pPr>
+        <w:tabs>
+          <w:tab w:val="num" w:pos="1440"/>
+        </w:tabs>
+        <w:ind w:left="1440" w:hanging="360"/>
+      </w:pPr>
+      <w:rPr>
+        <w:rFonts w:ascii="Courier New" w:hAnsi="Courier New" w:hint="default"/>
+        <w:sz w:val="20"/>
+      </w:rPr>
+    </w:lvl>
+    <w:lvl w:ilvl="2" w:tentative="1">
+      <w:start w:val="1"/>
+      <w:numFmt w:val="bullet"/>
+      <w:lvlText w:val=""/>
+      <w:lvlJc w:val="left"/>
+      <w:pPr>
+        <w:tabs>
+          <w:tab w:val="num" w:pos="2160"/>
+        </w:tabs>
+        <w:ind w:left="2160" w:hanging="360"/>
+      </w:pPr>
+      <w:rPr>
+        <w:rFonts w:ascii="Wingdings" w:hAnsi="Wingdings" w:hint="default"/>
+        <w:sz w:val="20"/>
+      </w:rPr>
+    </w:lvl>
+    <w:lvl w:ilvl="3" w:tentative="1">
+      <w:start w:val="1"/>
+      <w:numFmt w:val="bullet"/>
+      <w:lvlText w:val=""/>
+      <w:lvlJc w:val="left"/>
+      <w:pPr>
+        <w:tabs>
+          <w:tab w:val="num" w:pos="2880"/>
+        </w:tabs>
+        <w:ind w:left="2880" w:hanging="360"/>
+      </w:pPr>
+      <w:rPr>
+        <w:rFonts w:ascii="Wingdings" w:hAnsi="Wingdings" w:hint="default"/>
+        <w:sz w:val="20"/>
+      </w:rPr>
+    </w:lvl>
+    <w:lvl w:ilvl="4" w:tentative="1">
+      <w:start w:val="1"/>
+      <w:numFmt w:val="bullet"/>
+      <w:lvlText w:val=""/>
+      <w:lvlJc w:val="left"/>
+      <w:pPr>
+        <w:tabs>
+          <w:tab w:val="num" w:pos="3600"/>
+        </w:tabs>
+        <w:ind w:left="3600" w:hanging="360"/>
+      </w:pPr>
+      <w:rPr>
+        <w:rFonts w:ascii="Wingdings" w:hAnsi="Wingdings" w:hint="default"/>
+        <w:sz w:val="20"/>
+      </w:rPr>
+    </w:lvl>
+    <w:lvl w:ilvl="5" w:tentative="1">
+      <w:start w:val="1"/>
+      <w:numFmt w:val="bullet"/>
+      <w:lvlText w:val=""/>
+      <w:lvlJc w:val="left"/>
+      <w:pPr>
+        <w:tabs>
+          <w:tab w:val="num" w:pos="4320"/>
+        </w:tabs>
+        <w:ind w:left="4320" w:hanging="360"/>
+      </w:pPr>
+      <w:rPr>
+        <w:rFonts w:ascii="Wingdings" w:hAnsi="Wingdings" w:hint="default"/>
+        <w:sz w:val="20"/>
+      </w:rPr>
+    </w:lvl>
+    <w:lvl w:ilvl="6" w:tentative="1">
+      <w:start w:val="1"/>
+      <w:numFmt w:val="bullet"/>
+      <w:lvlText w:val=""/>
+      <w:lvlJc w:val="left"/>
+      <w:pPr>
+        <w:tabs>
+          <w:tab w:val="num" w:pos="5040"/>
+        </w:tabs>
+        <w:ind w:left="5040" w:hanging="360"/>
+      </w:pPr>
+      <w:rPr>
+        <w:rFonts w:ascii="Wingdings" w:hAnsi="Wingdings" w:hint="default"/>
+        <w:sz w:val="20"/>
+      </w:rPr>
+    </w:lvl>
+    <w:lvl w:ilvl="7" w:tentative="1">
+      <w:start w:val="1"/>
+      <w:numFmt w:val="bullet"/>
+      <w:lvlText w:val=""/>
+      <w:lvlJc w:val="left"/>
+      <w:pPr>
+        <w:tabs>
+          <w:tab w:val="num" w:pos="5760"/>
+        </w:tabs>
+        <w:ind w:left="5760" w:hanging="360"/>
+      </w:pPr>
+      <w:rPr>
+        <w:rFonts w:ascii="Wingdings" w:hAnsi="Wingdings" w:hint="default"/>
+        <w:sz w:val="20"/>
+      </w:rPr>
+    </w:lvl>
+    <w:lvl w:ilvl="8" w:tentative="1">
+      <w:start w:val="1"/>
+      <w:numFmt w:val="bullet"/>
+      <w:lvlText w:val=""/>
+      <w:lvlJc w:val="left"/>
+      <w:pPr>
+        <w:tabs>
+          <w:tab w:val="num" w:pos="6480"/>
+        </w:tabs>
+        <w:ind w:left="6480" w:hanging="360"/>
+      </w:pPr>
+      <w:rPr>
+        <w:rFonts w:ascii="Wingdings" w:hAnsi="Wingdings" w:hint="default"/>
+        <w:sz w:val="20"/>
+      </w:rPr>
+    </w:lvl>
+  </w:abstractNum>
+  <w:abstractNum w:abstractNumId="22" w15:restartNumberingAfterBreak="0">
     <w:nsid w:val="65E838C3"/>
     <w:multiLevelType w:val="multilevel"/>
     <w:tmpl w:val="3409001F"/>
@@ -3736,6 +6001,381 @@
       <w:pPr>
         <w:ind w:left="4320" w:hanging="1440"/>
       </w:pPr>
+    </w:lvl>
+  </w:abstractNum>
+  <w:abstractNum w:abstractNumId="23" w15:restartNumberingAfterBreak="0">
+    <w:nsid w:val="723529A5"/>
+    <w:multiLevelType w:val="hybridMultilevel"/>
+    <w:tmpl w:val="9B2681C0"/>
+    <w:lvl w:ilvl="0" w:tplc="04090001">
+      <w:start w:val="1"/>
+      <w:numFmt w:val="bullet"/>
+      <w:lvlText w:val=""/>
+      <w:lvlJc w:val="left"/>
+      <w:pPr>
+        <w:ind w:left="1080" w:hanging="360"/>
+      </w:pPr>
+      <w:rPr>
+        <w:rFonts w:ascii="Symbol" w:hAnsi="Symbol" w:hint="default"/>
+      </w:rPr>
+    </w:lvl>
+    <w:lvl w:ilvl="1" w:tplc="04090003" w:tentative="1">
+      <w:start w:val="1"/>
+      <w:numFmt w:val="bullet"/>
+      <w:lvlText w:val="o"/>
+      <w:lvlJc w:val="left"/>
+      <w:pPr>
+        <w:ind w:left="1800" w:hanging="360"/>
+      </w:pPr>
+      <w:rPr>
+        <w:rFonts w:ascii="Courier New" w:hAnsi="Courier New" w:cs="Courier New" w:hint="default"/>
+      </w:rPr>
+    </w:lvl>
+    <w:lvl w:ilvl="2" w:tplc="04090005" w:tentative="1">
+      <w:start w:val="1"/>
+      <w:numFmt w:val="bullet"/>
+      <w:lvlText w:val=""/>
+      <w:lvlJc w:val="left"/>
+      <w:pPr>
+        <w:ind w:left="2520" w:hanging="360"/>
+      </w:pPr>
+      <w:rPr>
+        <w:rFonts w:ascii="Wingdings" w:hAnsi="Wingdings" w:hint="default"/>
+      </w:rPr>
+    </w:lvl>
+    <w:lvl w:ilvl="3" w:tplc="04090001" w:tentative="1">
+      <w:start w:val="1"/>
+      <w:numFmt w:val="bullet"/>
+      <w:lvlText w:val=""/>
+      <w:lvlJc w:val="left"/>
+      <w:pPr>
+        <w:ind w:left="3240" w:hanging="360"/>
+      </w:pPr>
+      <w:rPr>
+        <w:rFonts w:ascii="Symbol" w:hAnsi="Symbol" w:hint="default"/>
+      </w:rPr>
+    </w:lvl>
+    <w:lvl w:ilvl="4" w:tplc="04090003" w:tentative="1">
+      <w:start w:val="1"/>
+      <w:numFmt w:val="bullet"/>
+      <w:lvlText w:val="o"/>
+      <w:lvlJc w:val="left"/>
+      <w:pPr>
+        <w:ind w:left="3960" w:hanging="360"/>
+      </w:pPr>
+      <w:rPr>
+        <w:rFonts w:ascii="Courier New" w:hAnsi="Courier New" w:cs="Courier New" w:hint="default"/>
+      </w:rPr>
+    </w:lvl>
+    <w:lvl w:ilvl="5" w:tplc="04090005" w:tentative="1">
+      <w:start w:val="1"/>
+      <w:numFmt w:val="bullet"/>
+      <w:lvlText w:val=""/>
+      <w:lvlJc w:val="left"/>
+      <w:pPr>
+        <w:ind w:left="4680" w:hanging="360"/>
+      </w:pPr>
+      <w:rPr>
+        <w:rFonts w:ascii="Wingdings" w:hAnsi="Wingdings" w:hint="default"/>
+      </w:rPr>
+    </w:lvl>
+    <w:lvl w:ilvl="6" w:tplc="04090001" w:tentative="1">
+      <w:start w:val="1"/>
+      <w:numFmt w:val="bullet"/>
+      <w:lvlText w:val=""/>
+      <w:lvlJc w:val="left"/>
+      <w:pPr>
+        <w:ind w:left="5400" w:hanging="360"/>
+      </w:pPr>
+      <w:rPr>
+        <w:rFonts w:ascii="Symbol" w:hAnsi="Symbol" w:hint="default"/>
+      </w:rPr>
+    </w:lvl>
+    <w:lvl w:ilvl="7" w:tplc="04090003" w:tentative="1">
+      <w:start w:val="1"/>
+      <w:numFmt w:val="bullet"/>
+      <w:lvlText w:val="o"/>
+      <w:lvlJc w:val="left"/>
+      <w:pPr>
+        <w:ind w:left="6120" w:hanging="360"/>
+      </w:pPr>
+      <w:rPr>
+        <w:rFonts w:ascii="Courier New" w:hAnsi="Courier New" w:cs="Courier New" w:hint="default"/>
+      </w:rPr>
+    </w:lvl>
+    <w:lvl w:ilvl="8" w:tplc="04090005" w:tentative="1">
+      <w:start w:val="1"/>
+      <w:numFmt w:val="bullet"/>
+      <w:lvlText w:val=""/>
+      <w:lvlJc w:val="left"/>
+      <w:pPr>
+        <w:ind w:left="6840" w:hanging="360"/>
+      </w:pPr>
+      <w:rPr>
+        <w:rFonts w:ascii="Wingdings" w:hAnsi="Wingdings" w:hint="default"/>
+      </w:rPr>
+    </w:lvl>
+  </w:abstractNum>
+  <w:abstractNum w:abstractNumId="24" w15:restartNumberingAfterBreak="0">
+    <w:nsid w:val="77A96B05"/>
+    <w:multiLevelType w:val="hybridMultilevel"/>
+    <w:tmpl w:val="D1123402"/>
+    <w:lvl w:ilvl="0" w:tplc="04090001">
+      <w:start w:val="1"/>
+      <w:numFmt w:val="bullet"/>
+      <w:lvlText w:val=""/>
+      <w:lvlJc w:val="left"/>
+      <w:pPr>
+        <w:ind w:left="1080" w:hanging="360"/>
+      </w:pPr>
+      <w:rPr>
+        <w:rFonts w:ascii="Symbol" w:hAnsi="Symbol" w:hint="default"/>
+      </w:rPr>
+    </w:lvl>
+    <w:lvl w:ilvl="1" w:tplc="04090003" w:tentative="1">
+      <w:start w:val="1"/>
+      <w:numFmt w:val="bullet"/>
+      <w:lvlText w:val="o"/>
+      <w:lvlJc w:val="left"/>
+      <w:pPr>
+        <w:ind w:left="1800" w:hanging="360"/>
+      </w:pPr>
+      <w:rPr>
+        <w:rFonts w:ascii="Courier New" w:hAnsi="Courier New" w:cs="Courier New" w:hint="default"/>
+      </w:rPr>
+    </w:lvl>
+    <w:lvl w:ilvl="2" w:tplc="04090005" w:tentative="1">
+      <w:start w:val="1"/>
+      <w:numFmt w:val="bullet"/>
+      <w:lvlText w:val=""/>
+      <w:lvlJc w:val="left"/>
+      <w:pPr>
+        <w:ind w:left="2520" w:hanging="360"/>
+      </w:pPr>
+      <w:rPr>
+        <w:rFonts w:ascii="Wingdings" w:hAnsi="Wingdings" w:hint="default"/>
+      </w:rPr>
+    </w:lvl>
+    <w:lvl w:ilvl="3" w:tplc="04090001" w:tentative="1">
+      <w:start w:val="1"/>
+      <w:numFmt w:val="bullet"/>
+      <w:lvlText w:val=""/>
+      <w:lvlJc w:val="left"/>
+      <w:pPr>
+        <w:ind w:left="3240" w:hanging="360"/>
+      </w:pPr>
+      <w:rPr>
+        <w:rFonts w:ascii="Symbol" w:hAnsi="Symbol" w:hint="default"/>
+      </w:rPr>
+    </w:lvl>
+    <w:lvl w:ilvl="4" w:tplc="04090003" w:tentative="1">
+      <w:start w:val="1"/>
+      <w:numFmt w:val="bullet"/>
+      <w:lvlText w:val="o"/>
+      <w:lvlJc w:val="left"/>
+      <w:pPr>
+        <w:ind w:left="3960" w:hanging="360"/>
+      </w:pPr>
+      <w:rPr>
+        <w:rFonts w:ascii="Courier New" w:hAnsi="Courier New" w:cs="Courier New" w:hint="default"/>
+      </w:rPr>
+    </w:lvl>
+    <w:lvl w:ilvl="5" w:tplc="04090005" w:tentative="1">
+      <w:start w:val="1"/>
+      <w:numFmt w:val="bullet"/>
+      <w:lvlText w:val=""/>
+      <w:lvlJc w:val="left"/>
+      <w:pPr>
+        <w:ind w:left="4680" w:hanging="360"/>
+      </w:pPr>
+      <w:rPr>
+        <w:rFonts w:ascii="Wingdings" w:hAnsi="Wingdings" w:hint="default"/>
+      </w:rPr>
+    </w:lvl>
+    <w:lvl w:ilvl="6" w:tplc="04090001" w:tentative="1">
+      <w:start w:val="1"/>
+      <w:numFmt w:val="bullet"/>
+      <w:lvlText w:val=""/>
+      <w:lvlJc w:val="left"/>
+      <w:pPr>
+        <w:ind w:left="5400" w:hanging="360"/>
+      </w:pPr>
+      <w:rPr>
+        <w:rFonts w:ascii="Symbol" w:hAnsi="Symbol" w:hint="default"/>
+      </w:rPr>
+    </w:lvl>
+    <w:lvl w:ilvl="7" w:tplc="04090003" w:tentative="1">
+      <w:start w:val="1"/>
+      <w:numFmt w:val="bullet"/>
+      <w:lvlText w:val="o"/>
+      <w:lvlJc w:val="left"/>
+      <w:pPr>
+        <w:ind w:left="6120" w:hanging="360"/>
+      </w:pPr>
+      <w:rPr>
+        <w:rFonts w:ascii="Courier New" w:hAnsi="Courier New" w:cs="Courier New" w:hint="default"/>
+      </w:rPr>
+    </w:lvl>
+    <w:lvl w:ilvl="8" w:tplc="04090005" w:tentative="1">
+      <w:start w:val="1"/>
+      <w:numFmt w:val="bullet"/>
+      <w:lvlText w:val=""/>
+      <w:lvlJc w:val="left"/>
+      <w:pPr>
+        <w:ind w:left="6840" w:hanging="360"/>
+      </w:pPr>
+      <w:rPr>
+        <w:rFonts w:ascii="Wingdings" w:hAnsi="Wingdings" w:hint="default"/>
+      </w:rPr>
+    </w:lvl>
+  </w:abstractNum>
+  <w:abstractNum w:abstractNumId="25" w15:restartNumberingAfterBreak="0">
+    <w:nsid w:val="792B3699"/>
+    <w:multiLevelType w:val="multilevel"/>
+    <w:tmpl w:val="A552E3AE"/>
+    <w:lvl w:ilvl="0">
+      <w:start w:val="1"/>
+      <w:numFmt w:val="bullet"/>
+      <w:lvlText w:val=""/>
+      <w:lvlJc w:val="left"/>
+      <w:pPr>
+        <w:tabs>
+          <w:tab w:val="num" w:pos="720"/>
+        </w:tabs>
+        <w:ind w:left="720" w:hanging="360"/>
+      </w:pPr>
+      <w:rPr>
+        <w:rFonts w:ascii="Symbol" w:hAnsi="Symbol" w:hint="default"/>
+        <w:sz w:val="20"/>
+      </w:rPr>
+    </w:lvl>
+    <w:lvl w:ilvl="1" w:tentative="1">
+      <w:start w:val="1"/>
+      <w:numFmt w:val="bullet"/>
+      <w:lvlText w:val="o"/>
+      <w:lvlJc w:val="left"/>
+      <w:pPr>
+        <w:tabs>
+          <w:tab w:val="num" w:pos="1440"/>
+        </w:tabs>
+        <w:ind w:left="1440" w:hanging="360"/>
+      </w:pPr>
+      <w:rPr>
+        <w:rFonts w:ascii="Courier New" w:hAnsi="Courier New" w:hint="default"/>
+        <w:sz w:val="20"/>
+      </w:rPr>
+    </w:lvl>
+    <w:lvl w:ilvl="2" w:tentative="1">
+      <w:start w:val="1"/>
+      <w:numFmt w:val="bullet"/>
+      <w:lvlText w:val=""/>
+      <w:lvlJc w:val="left"/>
+      <w:pPr>
+        <w:tabs>
+          <w:tab w:val="num" w:pos="2160"/>
+        </w:tabs>
+        <w:ind w:left="2160" w:hanging="360"/>
+      </w:pPr>
+      <w:rPr>
+        <w:rFonts w:ascii="Wingdings" w:hAnsi="Wingdings" w:hint="default"/>
+        <w:sz w:val="20"/>
+      </w:rPr>
+    </w:lvl>
+    <w:lvl w:ilvl="3" w:tentative="1">
+      <w:start w:val="1"/>
+      <w:numFmt w:val="bullet"/>
+      <w:lvlText w:val=""/>
+      <w:lvlJc w:val="left"/>
+      <w:pPr>
+        <w:tabs>
+          <w:tab w:val="num" w:pos="2880"/>
+        </w:tabs>
+        <w:ind w:left="2880" w:hanging="360"/>
+      </w:pPr>
+      <w:rPr>
+        <w:rFonts w:ascii="Wingdings" w:hAnsi="Wingdings" w:hint="default"/>
+        <w:sz w:val="20"/>
+      </w:rPr>
+    </w:lvl>
+    <w:lvl w:ilvl="4" w:tentative="1">
+      <w:start w:val="1"/>
+      <w:numFmt w:val="bullet"/>
+      <w:lvlText w:val=""/>
+      <w:lvlJc w:val="left"/>
+      <w:pPr>
+        <w:tabs>
+          <w:tab w:val="num" w:pos="3600"/>
+        </w:tabs>
+        <w:ind w:left="3600" w:hanging="360"/>
+      </w:pPr>
+      <w:rPr>
+        <w:rFonts w:ascii="Wingdings" w:hAnsi="Wingdings" w:hint="default"/>
+        <w:sz w:val="20"/>
+      </w:rPr>
+    </w:lvl>
+    <w:lvl w:ilvl="5" w:tentative="1">
+      <w:start w:val="1"/>
+      <w:numFmt w:val="bullet"/>
+      <w:lvlText w:val=""/>
+      <w:lvlJc w:val="left"/>
+      <w:pPr>
+        <w:tabs>
+          <w:tab w:val="num" w:pos="4320"/>
+        </w:tabs>
+        <w:ind w:left="4320" w:hanging="360"/>
+      </w:pPr>
+      <w:rPr>
+        <w:rFonts w:ascii="Wingdings" w:hAnsi="Wingdings" w:hint="default"/>
+        <w:sz w:val="20"/>
+      </w:rPr>
+    </w:lvl>
+    <w:lvl w:ilvl="6" w:tentative="1">
+      <w:start w:val="1"/>
+      <w:numFmt w:val="bullet"/>
+      <w:lvlText w:val=""/>
+      <w:lvlJc w:val="left"/>
+      <w:pPr>
+        <w:tabs>
+          <w:tab w:val="num" w:pos="5040"/>
+        </w:tabs>
+        <w:ind w:left="5040" w:hanging="360"/>
+      </w:pPr>
+      <w:rPr>
+        <w:rFonts w:ascii="Wingdings" w:hAnsi="Wingdings" w:hint="default"/>
+        <w:sz w:val="20"/>
+      </w:rPr>
+    </w:lvl>
+    <w:lvl w:ilvl="7" w:tentative="1">
+      <w:start w:val="1"/>
+      <w:numFmt w:val="bullet"/>
+      <w:lvlText w:val=""/>
+      <w:lvlJc w:val="left"/>
+      <w:pPr>
+        <w:tabs>
+          <w:tab w:val="num" w:pos="5760"/>
+        </w:tabs>
+        <w:ind w:left="5760" w:hanging="360"/>
+      </w:pPr>
+      <w:rPr>
+        <w:rFonts w:ascii="Wingdings" w:hAnsi="Wingdings" w:hint="default"/>
+        <w:sz w:val="20"/>
+      </w:rPr>
+    </w:lvl>
+    <w:lvl w:ilvl="8" w:tentative="1">
+      <w:start w:val="1"/>
+      <w:numFmt w:val="bullet"/>
+      <w:lvlText w:val=""/>
+      <w:lvlJc w:val="left"/>
+      <w:pPr>
+        <w:tabs>
+          <w:tab w:val="num" w:pos="6480"/>
+        </w:tabs>
+        <w:ind w:left="6480" w:hanging="360"/>
+      </w:pPr>
+      <w:rPr>
+        <w:rFonts w:ascii="Wingdings" w:hAnsi="Wingdings" w:hint="default"/>
+        <w:sz w:val="20"/>
+      </w:rPr>
     </w:lvl>
   </w:abstractNum>
   <w:num w:numId="1" w16cid:durableId="1560435011">
@@ -3766,13 +6406,55 @@
     <w:abstractNumId w:val="0"/>
   </w:num>
   <w:num w:numId="10" w16cid:durableId="1769306868">
-    <w:abstractNumId w:val="11"/>
+    <w:abstractNumId w:val="22"/>
   </w:num>
   <w:num w:numId="11" w16cid:durableId="298458484">
     <w:abstractNumId w:val="9"/>
   </w:num>
   <w:num w:numId="12" w16cid:durableId="2023125480">
+    <w:abstractNumId w:val="18"/>
+  </w:num>
+  <w:num w:numId="13" w16cid:durableId="139688458">
+    <w:abstractNumId w:val="17"/>
+  </w:num>
+  <w:num w:numId="14" w16cid:durableId="943073965">
+    <w:abstractNumId w:val="21"/>
+  </w:num>
+  <w:num w:numId="15" w16cid:durableId="775834845">
+    <w:abstractNumId w:val="24"/>
+  </w:num>
+  <w:num w:numId="16" w16cid:durableId="729231024">
+    <w:abstractNumId w:val="11"/>
+  </w:num>
+  <w:num w:numId="17" w16cid:durableId="1382972331">
+    <w:abstractNumId w:val="13"/>
+  </w:num>
+  <w:num w:numId="18" w16cid:durableId="1778597953">
+    <w:abstractNumId w:val="15"/>
+  </w:num>
+  <w:num w:numId="19" w16cid:durableId="648168388">
+    <w:abstractNumId w:val="25"/>
+  </w:num>
+  <w:num w:numId="20" w16cid:durableId="1956279905">
+    <w:abstractNumId w:val="19"/>
+  </w:num>
+  <w:num w:numId="21" w16cid:durableId="1785883314">
+    <w:abstractNumId w:val="23"/>
+  </w:num>
+  <w:num w:numId="22" w16cid:durableId="2077167479">
     <w:abstractNumId w:val="10"/>
+  </w:num>
+  <w:num w:numId="23" w16cid:durableId="807164080">
+    <w:abstractNumId w:val="14"/>
+  </w:num>
+  <w:num w:numId="24" w16cid:durableId="693579383">
+    <w:abstractNumId w:val="20"/>
+  </w:num>
+  <w:num w:numId="25" w16cid:durableId="418451827">
+    <w:abstractNumId w:val="16"/>
+  </w:num>
+  <w:num w:numId="26" w16cid:durableId="1446579447">
+    <w:abstractNumId w:val="12"/>
   </w:num>
 </w:numbering>
 </file>
@@ -4380,7 +7062,6 @@
   <w:style w:type="character" w:default="1" w:styleId="DefaultParagraphFont">
     <w:name w:val="Default Paragraph Font"/>
     <w:uiPriority w:val="1"/>
-    <w:semiHidden/>
     <w:unhideWhenUsed/>
   </w:style>
   <w:style w:type="table" w:default="1" w:styleId="TableNormal">
@@ -15205,6 +17886,21 @@
       <w:u w:val="single"/>
     </w:rPr>
   </w:style>
+  <w:style w:type="paragraph" w:styleId="NormalWeb">
+    <w:name w:val="Normal (Web)"/>
+    <w:basedOn w:val="Normal"/>
+    <w:uiPriority w:val="99"/>
+    <w:unhideWhenUsed/>
+    <w:rsid w:val="000F0AA4"/>
+    <w:pPr>
+      <w:spacing w:before="100" w:beforeAutospacing="1" w:after="100" w:afterAutospacing="1" w:line="240" w:lineRule="auto"/>
+    </w:pPr>
+    <w:rPr>
+      <w:rFonts w:ascii="Times New Roman" w:eastAsia="Times New Roman" w:hAnsi="Times New Roman" w:cs="Times New Roman"/>
+      <w:sz w:val="24"/>
+      <w:szCs w:val="24"/>
+    </w:rPr>
+  </w:style>
 </w:styles>
 </file>
 

</xml_diff>